<commit_message>
Questionnaire: add Existing Processes section and Annex C register
New section I (8 questions) and a fillable Process and Document Register
for project onboarding, scoring, approvals and reporting artefacts, feeding
an Afronovation fit-gap review. Letter now says eleven areas.

Co-Authored-By: Claude Opus 5.5 <noreply@anthropic.com>
Claude-Session: https://claude.ai/code/session_01X474181YGTsF16kamYY3c3
</commit_message>
<xml_diff>
--- a/docs/pre-implementation/ZIDA-Pre-Implementation-Discovery-Questionnaire.docx
+++ b/docs/pre-implementation/ZIDA-Pre-Implementation-Discovery-Questionnaire.docx
@@ -1962,7 +1962,7 @@
           <w:sz w:val="21"/>
           <w:szCs w:val="21"/>
         </w:rPr>
-        <w:t xml:space="preserve">Annex A records the official domain and email position of each ministry. Annex B identifies the key contacts for the engagement.</w:t>
+        <w:t xml:space="preserve">Annex A records the official domain and email position of each ministry. Annex B identifies the key contacts for the engagement. Annex C lists ZIDA’s existing processes and documents; blank templates or samples may be attached and are covered by the non-disclosure agreement between ZIDA and Afronovation.</w:t>
       </w:r>
     </w:p>
     <w:p>
@@ -9619,7 +9619,996 @@
           <w:sz w:val="28"/>
           <w:szCs w:val="28"/>
         </w:rPr>
-        <w:t xml:space="preserve">I.  Team Capability, Support and Operating Model</w:t>
+        <w:t xml:space="preserve">I.  Existing Processes, Documents and Workflows</w:t>
+      </w:r>
+    </w:p>
+    <w:p>
+      <w:pPr>
+        <w:keepNext/>
+        <w:spacing w:after="120" w:line="276"/>
+      </w:pPr>
+      <w:r>
+        <w:rPr>
+          <w:rFonts w:ascii="Calibri" w:cs="Calibri" w:eastAsia="Calibri" w:hAnsi="Calibri"/>
+          <w:i/>
+          <w:iCs/>
+          <w:color w:val="5F6B66"/>
+          <w:sz w:val="21"/>
+          <w:szCs w:val="21"/>
+        </w:rPr>
+        <w:t xml:space="preserve">ZIDA’s existing processes, templates and evaluation criteria represent valuable institutional knowledge. Understanding them allows the platform to digitise what works, strengthen what can be improved, and avoid duplicating effort.</w:t>
+      </w:r>
+    </w:p>
+    <w:p>
+      <w:pPr>
+        <w:keepNext/>
+        <w:pBdr>
+          <w:left w:val="single" w:color="B8860B" w:sz="18" w:space="8"/>
+        </w:pBdr>
+        <w:shd w:fill="EEF3EF" w:color="auto" w:val="clear"/>
+        <w:spacing w:after="160" w:before="60"/>
+        <w:ind w:left="120"/>
+      </w:pPr>
+      <w:r>
+        <w:rPr>
+          <w:rFonts w:ascii="Calibri" w:cs="Calibri" w:eastAsia="Calibri" w:hAnsi="Calibri"/>
+          <w:b/>
+          <w:bCs/>
+          <w:color w:val="14532D"/>
+          <w:sz w:val="20"/>
+          <w:szCs w:val="20"/>
+        </w:rPr>
+        <w:t xml:space="preserve">NDAP alignment — </w:t>
+      </w:r>
+      <w:r>
+        <w:rPr>
+          <w:rFonts w:ascii="Calibri" w:cs="Calibri" w:eastAsia="Calibri" w:hAnsi="Calibri"/>
+          <w:b/>
+          <w:bCs/>
+          <w:color w:val="B8860B"/>
+          <w:sz w:val="20"/>
+          <w:szCs w:val="20"/>
+        </w:rPr>
+        <w:t xml:space="preserve">NDS2 / Smart Zimbabwe 2030: </w:t>
+      </w:r>
+      <w:r>
+        <w:rPr>
+          <w:rFonts w:ascii="Calibri" w:cs="Calibri" w:eastAsia="Calibri" w:hAnsi="Calibri"/>
+          <w:sz w:val="20"/>
+          <w:szCs w:val="20"/>
+        </w:rPr>
+        <w:t xml:space="preserve">digitising Government’s proven processes, rather than replacing them, protects institutional knowledge and speeds adoption across ministries.</w:t>
+      </w:r>
+    </w:p>
+    <w:tbl>
+      <w:tblPr>
+        <w:tblW w:type="dxa" w:w="9638"/>
+        <w:tblBorders>
+          <w:top w:val="single" w:color="auto" w:sz="4"/>
+          <w:left w:val="single" w:color="auto" w:sz="4"/>
+          <w:bottom w:val="single" w:color="auto" w:sz="4"/>
+          <w:right w:val="single" w:color="auto" w:sz="4"/>
+          <w:insideH w:val="single" w:color="auto" w:sz="4"/>
+          <w:insideV w:val="single" w:color="auto" w:sz="4"/>
+        </w:tblBorders>
+        <w:tblLayout w:type="fixed"/>
+      </w:tblPr>
+      <w:tblGrid>
+        <w:gridCol w:w="700"/>
+        <w:gridCol w:w="5438"/>
+        <w:gridCol w:w="3500"/>
+      </w:tblGrid>
+      <w:tr>
+        <w:trPr>
+          <w:tblHeader/>
+        </w:trPr>
+        <w:tc>
+          <w:tcPr>
+            <w:tcW w:type="dxa" w:w="700"/>
+            <w:tcBorders>
+              <w:top w:val="single" w:color="C9D3CD" w:sz="4"/>
+              <w:left w:val="single" w:color="C9D3CD" w:sz="4"/>
+              <w:bottom w:val="single" w:color="C9D3CD" w:sz="4"/>
+              <w:right w:val="single" w:color="C9D3CD" w:sz="4"/>
+            </w:tcBorders>
+            <w:shd w:fill="14532D" w:color="auto" w:val="clear"/>
+            <w:tcMar>
+              <w:top w:type="dxa" w:w="80"/>
+              <w:left w:type="dxa" w:w="110"/>
+              <w:bottom w:type="dxa" w:w="80"/>
+              <w:right w:type="dxa" w:w="110"/>
+            </w:tcMar>
+          </w:tcPr>
+          <w:p>
+            <w:pPr>
+              <w:spacing w:after="0"/>
+            </w:pPr>
+            <w:r>
+              <w:rPr>
+                <w:rFonts w:ascii="Calibri" w:cs="Calibri" w:eastAsia="Calibri" w:hAnsi="Calibri"/>
+                <w:b/>
+                <w:bCs/>
+                <w:color w:val="FFFFFF"/>
+                <w:sz w:val="19"/>
+                <w:szCs w:val="19"/>
+              </w:rPr>
+              <w:t xml:space="preserve">No.</w:t>
+            </w:r>
+          </w:p>
+        </w:tc>
+        <w:tc>
+          <w:tcPr>
+            <w:tcW w:type="dxa" w:w="5438"/>
+            <w:tcBorders>
+              <w:top w:val="single" w:color="C9D3CD" w:sz="4"/>
+              <w:left w:val="single" w:color="C9D3CD" w:sz="4"/>
+              <w:bottom w:val="single" w:color="C9D3CD" w:sz="4"/>
+              <w:right w:val="single" w:color="C9D3CD" w:sz="4"/>
+            </w:tcBorders>
+            <w:shd w:fill="14532D" w:color="auto" w:val="clear"/>
+            <w:tcMar>
+              <w:top w:type="dxa" w:w="80"/>
+              <w:left w:type="dxa" w:w="110"/>
+              <w:bottom w:type="dxa" w:w="80"/>
+              <w:right w:type="dxa" w:w="110"/>
+            </w:tcMar>
+          </w:tcPr>
+          <w:p>
+            <w:pPr>
+              <w:spacing w:after="0"/>
+            </w:pPr>
+            <w:r>
+              <w:rPr>
+                <w:rFonts w:ascii="Calibri" w:cs="Calibri" w:eastAsia="Calibri" w:hAnsi="Calibri"/>
+                <w:b/>
+                <w:bCs/>
+                <w:color w:val="FFFFFF"/>
+                <w:sz w:val="19"/>
+                <w:szCs w:val="19"/>
+              </w:rPr>
+              <w:t xml:space="preserve">Question</w:t>
+            </w:r>
+          </w:p>
+        </w:tc>
+        <w:tc>
+          <w:tcPr>
+            <w:tcW w:type="dxa" w:w="3500"/>
+            <w:tcBorders>
+              <w:top w:val="single" w:color="C9D3CD" w:sz="4"/>
+              <w:left w:val="single" w:color="C9D3CD" w:sz="4"/>
+              <w:bottom w:val="single" w:color="C9D3CD" w:sz="4"/>
+              <w:right w:val="single" w:color="C9D3CD" w:sz="4"/>
+            </w:tcBorders>
+            <w:shd w:fill="14532D" w:color="auto" w:val="clear"/>
+            <w:tcMar>
+              <w:top w:type="dxa" w:w="80"/>
+              <w:left w:type="dxa" w:w="110"/>
+              <w:bottom w:type="dxa" w:w="80"/>
+              <w:right w:type="dxa" w:w="110"/>
+            </w:tcMar>
+          </w:tcPr>
+          <w:p>
+            <w:pPr>
+              <w:spacing w:after="0"/>
+            </w:pPr>
+            <w:r>
+              <w:rPr>
+                <w:rFonts w:ascii="Calibri" w:cs="Calibri" w:eastAsia="Calibri" w:hAnsi="Calibri"/>
+                <w:b/>
+                <w:bCs/>
+                <w:color w:val="FFFFFF"/>
+                <w:sz w:val="19"/>
+                <w:szCs w:val="19"/>
+              </w:rPr>
+              <w:t xml:space="preserve">Response</w:t>
+            </w:r>
+          </w:p>
+        </w:tc>
+      </w:tr>
+      <w:tr>
+        <w:trPr>
+          <w:cantSplit/>
+        </w:trPr>
+        <w:tc>
+          <w:tcPr>
+            <w:tcW w:type="dxa" w:w="700"/>
+            <w:tcBorders>
+              <w:top w:val="single" w:color="C9D3CD" w:sz="4"/>
+              <w:left w:val="single" w:color="C9D3CD" w:sz="4"/>
+              <w:bottom w:val="single" w:color="C9D3CD" w:sz="4"/>
+              <w:right w:val="single" w:color="C9D3CD" w:sz="4"/>
+            </w:tcBorders>
+            <w:shd w:fill="FAFBFA" w:color="auto" w:val="clear"/>
+            <w:tcMar>
+              <w:top w:type="dxa" w:w="80"/>
+              <w:left w:type="dxa" w:w="110"/>
+              <w:bottom w:type="dxa" w:w="80"/>
+              <w:right w:type="dxa" w:w="110"/>
+            </w:tcMar>
+          </w:tcPr>
+          <w:p>
+            <w:pPr>
+              <w:spacing w:after="0"/>
+            </w:pPr>
+            <w:r>
+              <w:rPr>
+                <w:rFonts w:ascii="Calibri" w:cs="Calibri" w:eastAsia="Calibri" w:hAnsi="Calibri"/>
+                <w:sz w:val="20"/>
+                <w:szCs w:val="20"/>
+              </w:rPr>
+              <w:t xml:space="preserve">I1</w:t>
+            </w:r>
+          </w:p>
+        </w:tc>
+        <w:tc>
+          <w:tcPr>
+            <w:tcW w:type="dxa" w:w="5438"/>
+            <w:tcBorders>
+              <w:top w:val="single" w:color="C9D3CD" w:sz="4"/>
+              <w:left w:val="single" w:color="C9D3CD" w:sz="4"/>
+              <w:bottom w:val="single" w:color="C9D3CD" w:sz="4"/>
+              <w:right w:val="single" w:color="C9D3CD" w:sz="4"/>
+            </w:tcBorders>
+            <w:shd w:fill="FAFBFA" w:color="auto" w:val="clear"/>
+            <w:tcMar>
+              <w:top w:type="dxa" w:w="80"/>
+              <w:left w:type="dxa" w:w="110"/>
+              <w:bottom w:type="dxa" w:w="80"/>
+              <w:right w:type="dxa" w:w="110"/>
+            </w:tcMar>
+          </w:tcPr>
+          <w:p>
+            <w:pPr>
+              <w:spacing w:after="0"/>
+            </w:pPr>
+            <w:r>
+              <w:rPr>
+                <w:rFonts w:ascii="Calibri" w:cs="Calibri" w:eastAsia="Calibri" w:hAnsi="Calibri"/>
+                <w:sz w:val="20"/>
+                <w:szCs w:val="20"/>
+              </w:rPr>
+              <w:t xml:space="preserve">What process does ZIDA follow from receiving a project proposal to publishing it? Please list each related document or form in Annex C.</w:t>
+            </w:r>
+          </w:p>
+        </w:tc>
+        <w:tc>
+          <w:tcPr>
+            <w:tcW w:type="dxa" w:w="3500"/>
+            <w:tcBorders>
+              <w:top w:val="single" w:color="C9D3CD" w:sz="4"/>
+              <w:left w:val="single" w:color="C9D3CD" w:sz="4"/>
+              <w:bottom w:val="single" w:color="C9D3CD" w:sz="4"/>
+              <w:right w:val="single" w:color="C9D3CD" w:sz="4"/>
+            </w:tcBorders>
+            <w:shd w:fill="FAFBFA" w:color="auto" w:val="clear"/>
+            <w:tcMar>
+              <w:top w:type="dxa" w:w="80"/>
+              <w:left w:type="dxa" w:w="110"/>
+              <w:bottom w:type="dxa" w:w="80"/>
+              <w:right w:type="dxa" w:w="110"/>
+            </w:tcMar>
+          </w:tcPr>
+          <w:p>
+            <w:pPr>
+              <w:spacing w:after="0"/>
+            </w:pPr>
+            <w:r>
+              <w:rPr>
+                <w:rFonts w:ascii="Calibri" w:cs="Calibri" w:eastAsia="Calibri" w:hAnsi="Calibri"/>
+                <w:sz w:val="20"/>
+                <w:szCs w:val="20"/>
+              </w:rPr>
+              <w:t xml:space="preserve"/>
+            </w:r>
+          </w:p>
+        </w:tc>
+      </w:tr>
+      <w:tr>
+        <w:trPr>
+          <w:cantSplit/>
+        </w:trPr>
+        <w:tc>
+          <w:tcPr>
+            <w:tcW w:type="dxa" w:w="700"/>
+            <w:tcBorders>
+              <w:top w:val="single" w:color="C9D3CD" w:sz="4"/>
+              <w:left w:val="single" w:color="C9D3CD" w:sz="4"/>
+              <w:bottom w:val="single" w:color="C9D3CD" w:sz="4"/>
+              <w:right w:val="single" w:color="C9D3CD" w:sz="4"/>
+            </w:tcBorders>
+            <w:shd w:fill="FFFFFF" w:color="auto" w:val="clear"/>
+            <w:tcMar>
+              <w:top w:type="dxa" w:w="80"/>
+              <w:left w:type="dxa" w:w="110"/>
+              <w:bottom w:type="dxa" w:w="80"/>
+              <w:right w:type="dxa" w:w="110"/>
+            </w:tcMar>
+          </w:tcPr>
+          <w:p>
+            <w:pPr>
+              <w:spacing w:after="0"/>
+            </w:pPr>
+            <w:r>
+              <w:rPr>
+                <w:rFonts w:ascii="Calibri" w:cs="Calibri" w:eastAsia="Calibri" w:hAnsi="Calibri"/>
+                <w:sz w:val="20"/>
+                <w:szCs w:val="20"/>
+              </w:rPr>
+              <w:t xml:space="preserve">I2</w:t>
+            </w:r>
+          </w:p>
+        </w:tc>
+        <w:tc>
+          <w:tcPr>
+            <w:tcW w:type="dxa" w:w="5438"/>
+            <w:tcBorders>
+              <w:top w:val="single" w:color="C9D3CD" w:sz="4"/>
+              <w:left w:val="single" w:color="C9D3CD" w:sz="4"/>
+              <w:bottom w:val="single" w:color="C9D3CD" w:sz="4"/>
+              <w:right w:val="single" w:color="C9D3CD" w:sz="4"/>
+            </w:tcBorders>
+            <w:shd w:fill="FFFFFF" w:color="auto" w:val="clear"/>
+            <w:tcMar>
+              <w:top w:type="dxa" w:w="80"/>
+              <w:left w:type="dxa" w:w="110"/>
+              <w:bottom w:type="dxa" w:w="80"/>
+              <w:right w:type="dxa" w:w="110"/>
+            </w:tcMar>
+          </w:tcPr>
+          <w:p>
+            <w:pPr>
+              <w:spacing w:after="0"/>
+            </w:pPr>
+            <w:r>
+              <w:rPr>
+                <w:rFonts w:ascii="Calibri" w:cs="Calibri" w:eastAsia="Calibri" w:hAnsi="Calibri"/>
+                <w:sz w:val="20"/>
+                <w:szCs w:val="20"/>
+              </w:rPr>
+              <w:t xml:space="preserve">Does ZIDA use criteria, a scoring model or a checklist to assess, prioritise or rank projects (for example, readiness, bankability or strategic fit)? Who applies it, and who approves the result?</w:t>
+            </w:r>
+          </w:p>
+        </w:tc>
+        <w:tc>
+          <w:tcPr>
+            <w:tcW w:type="dxa" w:w="3500"/>
+            <w:tcBorders>
+              <w:top w:val="single" w:color="C9D3CD" w:sz="4"/>
+              <w:left w:val="single" w:color="C9D3CD" w:sz="4"/>
+              <w:bottom w:val="single" w:color="C9D3CD" w:sz="4"/>
+              <w:right w:val="single" w:color="C9D3CD" w:sz="4"/>
+            </w:tcBorders>
+            <w:shd w:fill="FFFFFF" w:color="auto" w:val="clear"/>
+            <w:tcMar>
+              <w:top w:type="dxa" w:w="80"/>
+              <w:left w:type="dxa" w:w="110"/>
+              <w:bottom w:type="dxa" w:w="80"/>
+              <w:right w:type="dxa" w:w="110"/>
+            </w:tcMar>
+          </w:tcPr>
+          <w:p>
+            <w:pPr>
+              <w:spacing w:after="0"/>
+            </w:pPr>
+            <w:r>
+              <w:rPr>
+                <w:rFonts w:ascii="Calibri" w:cs="Calibri" w:eastAsia="Calibri" w:hAnsi="Calibri"/>
+                <w:sz w:val="20"/>
+                <w:szCs w:val="20"/>
+              </w:rPr>
+              <w:t xml:space="preserve"/>
+            </w:r>
+          </w:p>
+        </w:tc>
+      </w:tr>
+      <w:tr>
+        <w:trPr>
+          <w:cantSplit/>
+        </w:trPr>
+        <w:tc>
+          <w:tcPr>
+            <w:tcW w:type="dxa" w:w="700"/>
+            <w:tcBorders>
+              <w:top w:val="single" w:color="C9D3CD" w:sz="4"/>
+              <w:left w:val="single" w:color="C9D3CD" w:sz="4"/>
+              <w:bottom w:val="single" w:color="C9D3CD" w:sz="4"/>
+              <w:right w:val="single" w:color="C9D3CD" w:sz="4"/>
+            </w:tcBorders>
+            <w:shd w:fill="FAFBFA" w:color="auto" w:val="clear"/>
+            <w:tcMar>
+              <w:top w:type="dxa" w:w="80"/>
+              <w:left w:type="dxa" w:w="110"/>
+              <w:bottom w:type="dxa" w:w="80"/>
+              <w:right w:type="dxa" w:w="110"/>
+            </w:tcMar>
+          </w:tcPr>
+          <w:p>
+            <w:pPr>
+              <w:spacing w:after="0"/>
+            </w:pPr>
+            <w:r>
+              <w:rPr>
+                <w:rFonts w:ascii="Calibri" w:cs="Calibri" w:eastAsia="Calibri" w:hAnsi="Calibri"/>
+                <w:sz w:val="20"/>
+                <w:szCs w:val="20"/>
+              </w:rPr>
+              <w:t xml:space="preserve">I3</w:t>
+            </w:r>
+          </w:p>
+        </w:tc>
+        <w:tc>
+          <w:tcPr>
+            <w:tcW w:type="dxa" w:w="5438"/>
+            <w:tcBorders>
+              <w:top w:val="single" w:color="C9D3CD" w:sz="4"/>
+              <w:left w:val="single" w:color="C9D3CD" w:sz="4"/>
+              <w:bottom w:val="single" w:color="C9D3CD" w:sz="4"/>
+              <w:right w:val="single" w:color="C9D3CD" w:sz="4"/>
+            </w:tcBorders>
+            <w:shd w:fill="FAFBFA" w:color="auto" w:val="clear"/>
+            <w:tcMar>
+              <w:top w:type="dxa" w:w="80"/>
+              <w:left w:type="dxa" w:w="110"/>
+              <w:bottom w:type="dxa" w:w="80"/>
+              <w:right w:type="dxa" w:w="110"/>
+            </w:tcMar>
+          </w:tcPr>
+          <w:p>
+            <w:pPr>
+              <w:spacing w:after="0"/>
+            </w:pPr>
+            <w:r>
+              <w:rPr>
+                <w:rFonts w:ascii="Calibri" w:cs="Calibri" w:eastAsia="Calibri" w:hAnsi="Calibri"/>
+                <w:sz w:val="20"/>
+                <w:szCs w:val="20"/>
+              </w:rPr>
+              <w:t xml:space="preserve">Which forms, templates or checklists do ministries or project owners complete when submitting a project?</w:t>
+            </w:r>
+          </w:p>
+        </w:tc>
+        <w:tc>
+          <w:tcPr>
+            <w:tcW w:type="dxa" w:w="3500"/>
+            <w:tcBorders>
+              <w:top w:val="single" w:color="C9D3CD" w:sz="4"/>
+              <w:left w:val="single" w:color="C9D3CD" w:sz="4"/>
+              <w:bottom w:val="single" w:color="C9D3CD" w:sz="4"/>
+              <w:right w:val="single" w:color="C9D3CD" w:sz="4"/>
+            </w:tcBorders>
+            <w:shd w:fill="FAFBFA" w:color="auto" w:val="clear"/>
+            <w:tcMar>
+              <w:top w:type="dxa" w:w="80"/>
+              <w:left w:type="dxa" w:w="110"/>
+              <w:bottom w:type="dxa" w:w="80"/>
+              <w:right w:type="dxa" w:w="110"/>
+            </w:tcMar>
+          </w:tcPr>
+          <w:p>
+            <w:pPr>
+              <w:spacing w:after="0"/>
+            </w:pPr>
+            <w:r>
+              <w:rPr>
+                <w:rFonts w:ascii="Calibri" w:cs="Calibri" w:eastAsia="Calibri" w:hAnsi="Calibri"/>
+                <w:sz w:val="20"/>
+                <w:szCs w:val="20"/>
+              </w:rPr>
+              <w:t xml:space="preserve"/>
+            </w:r>
+          </w:p>
+        </w:tc>
+      </w:tr>
+      <w:tr>
+        <w:trPr>
+          <w:cantSplit/>
+        </w:trPr>
+        <w:tc>
+          <w:tcPr>
+            <w:tcW w:type="dxa" w:w="700"/>
+            <w:tcBorders>
+              <w:top w:val="single" w:color="C9D3CD" w:sz="4"/>
+              <w:left w:val="single" w:color="C9D3CD" w:sz="4"/>
+              <w:bottom w:val="single" w:color="C9D3CD" w:sz="4"/>
+              <w:right w:val="single" w:color="C9D3CD" w:sz="4"/>
+            </w:tcBorders>
+            <w:shd w:fill="FFFFFF" w:color="auto" w:val="clear"/>
+            <w:tcMar>
+              <w:top w:type="dxa" w:w="80"/>
+              <w:left w:type="dxa" w:w="110"/>
+              <w:bottom w:type="dxa" w:w="80"/>
+              <w:right w:type="dxa" w:w="110"/>
+            </w:tcMar>
+          </w:tcPr>
+          <w:p>
+            <w:pPr>
+              <w:spacing w:after="0"/>
+            </w:pPr>
+            <w:r>
+              <w:rPr>
+                <w:rFonts w:ascii="Calibri" w:cs="Calibri" w:eastAsia="Calibri" w:hAnsi="Calibri"/>
+                <w:sz w:val="20"/>
+                <w:szCs w:val="20"/>
+              </w:rPr>
+              <w:t xml:space="preserve">I4</w:t>
+            </w:r>
+          </w:p>
+        </w:tc>
+        <w:tc>
+          <w:tcPr>
+            <w:tcW w:type="dxa" w:w="5438"/>
+            <w:tcBorders>
+              <w:top w:val="single" w:color="C9D3CD" w:sz="4"/>
+              <w:left w:val="single" w:color="C9D3CD" w:sz="4"/>
+              <w:bottom w:val="single" w:color="C9D3CD" w:sz="4"/>
+              <w:right w:val="single" w:color="C9D3CD" w:sz="4"/>
+            </w:tcBorders>
+            <w:shd w:fill="FFFFFF" w:color="auto" w:val="clear"/>
+            <w:tcMar>
+              <w:top w:type="dxa" w:w="80"/>
+              <w:left w:type="dxa" w:w="110"/>
+              <w:bottom w:type="dxa" w:w="80"/>
+              <w:right w:type="dxa" w:w="110"/>
+            </w:tcMar>
+          </w:tcPr>
+          <w:p>
+            <w:pPr>
+              <w:spacing w:after="0"/>
+            </w:pPr>
+            <w:r>
+              <w:rPr>
+                <w:rFonts w:ascii="Calibri" w:cs="Calibri" w:eastAsia="Calibri" w:hAnsi="Calibri"/>
+                <w:sz w:val="20"/>
+                <w:szCs w:val="20"/>
+              </w:rPr>
+              <w:t xml:space="preserve">Which investor-related processes (registration, due diligence, accreditation, licensing, aftercare) currently rely on documents or systems outside the platform?</w:t>
+            </w:r>
+          </w:p>
+        </w:tc>
+        <w:tc>
+          <w:tcPr>
+            <w:tcW w:type="dxa" w:w="3500"/>
+            <w:tcBorders>
+              <w:top w:val="single" w:color="C9D3CD" w:sz="4"/>
+              <w:left w:val="single" w:color="C9D3CD" w:sz="4"/>
+              <w:bottom w:val="single" w:color="C9D3CD" w:sz="4"/>
+              <w:right w:val="single" w:color="C9D3CD" w:sz="4"/>
+            </w:tcBorders>
+            <w:shd w:fill="FFFFFF" w:color="auto" w:val="clear"/>
+            <w:tcMar>
+              <w:top w:type="dxa" w:w="80"/>
+              <w:left w:type="dxa" w:w="110"/>
+              <w:bottom w:type="dxa" w:w="80"/>
+              <w:right w:type="dxa" w:w="110"/>
+            </w:tcMar>
+          </w:tcPr>
+          <w:p>
+            <w:pPr>
+              <w:spacing w:after="0"/>
+            </w:pPr>
+            <w:r>
+              <w:rPr>
+                <w:rFonts w:ascii="Calibri" w:cs="Calibri" w:eastAsia="Calibri" w:hAnsi="Calibri"/>
+                <w:sz w:val="20"/>
+                <w:szCs w:val="20"/>
+              </w:rPr>
+              <w:t xml:space="preserve"/>
+            </w:r>
+          </w:p>
+        </w:tc>
+      </w:tr>
+      <w:tr>
+        <w:trPr>
+          <w:cantSplit/>
+        </w:trPr>
+        <w:tc>
+          <w:tcPr>
+            <w:tcW w:type="dxa" w:w="700"/>
+            <w:tcBorders>
+              <w:top w:val="single" w:color="C9D3CD" w:sz="4"/>
+              <w:left w:val="single" w:color="C9D3CD" w:sz="4"/>
+              <w:bottom w:val="single" w:color="C9D3CD" w:sz="4"/>
+              <w:right w:val="single" w:color="C9D3CD" w:sz="4"/>
+            </w:tcBorders>
+            <w:shd w:fill="FAFBFA" w:color="auto" w:val="clear"/>
+            <w:tcMar>
+              <w:top w:type="dxa" w:w="80"/>
+              <w:left w:type="dxa" w:w="110"/>
+              <w:bottom w:type="dxa" w:w="80"/>
+              <w:right w:type="dxa" w:w="110"/>
+            </w:tcMar>
+          </w:tcPr>
+          <w:p>
+            <w:pPr>
+              <w:spacing w:after="0"/>
+            </w:pPr>
+            <w:r>
+              <w:rPr>
+                <w:rFonts w:ascii="Calibri" w:cs="Calibri" w:eastAsia="Calibri" w:hAnsi="Calibri"/>
+                <w:sz w:val="20"/>
+                <w:szCs w:val="20"/>
+              </w:rPr>
+              <w:t xml:space="preserve">I5</w:t>
+            </w:r>
+          </w:p>
+        </w:tc>
+        <w:tc>
+          <w:tcPr>
+            <w:tcW w:type="dxa" w:w="5438"/>
+            <w:tcBorders>
+              <w:top w:val="single" w:color="C9D3CD" w:sz="4"/>
+              <w:left w:val="single" w:color="C9D3CD" w:sz="4"/>
+              <w:bottom w:val="single" w:color="C9D3CD" w:sz="4"/>
+              <w:right w:val="single" w:color="C9D3CD" w:sz="4"/>
+            </w:tcBorders>
+            <w:shd w:fill="FAFBFA" w:color="auto" w:val="clear"/>
+            <w:tcMar>
+              <w:top w:type="dxa" w:w="80"/>
+              <w:left w:type="dxa" w:w="110"/>
+              <w:bottom w:type="dxa" w:w="80"/>
+              <w:right w:type="dxa" w:w="110"/>
+            </w:tcMar>
+          </w:tcPr>
+          <w:p>
+            <w:pPr>
+              <w:spacing w:after="0"/>
+            </w:pPr>
+            <w:r>
+              <w:rPr>
+                <w:rFonts w:ascii="Calibri" w:cs="Calibri" w:eastAsia="Calibri" w:hAnsi="Calibri"/>
+                <w:sz w:val="20"/>
+                <w:szCs w:val="20"/>
+              </w:rPr>
+              <w:t xml:space="preserve">Which approval steps, committees or sign-offs does a project or agreement pass through before a decision?</w:t>
+            </w:r>
+          </w:p>
+        </w:tc>
+        <w:tc>
+          <w:tcPr>
+            <w:tcW w:type="dxa" w:w="3500"/>
+            <w:tcBorders>
+              <w:top w:val="single" w:color="C9D3CD" w:sz="4"/>
+              <w:left w:val="single" w:color="C9D3CD" w:sz="4"/>
+              <w:bottom w:val="single" w:color="C9D3CD" w:sz="4"/>
+              <w:right w:val="single" w:color="C9D3CD" w:sz="4"/>
+            </w:tcBorders>
+            <w:shd w:fill="FAFBFA" w:color="auto" w:val="clear"/>
+            <w:tcMar>
+              <w:top w:type="dxa" w:w="80"/>
+              <w:left w:type="dxa" w:w="110"/>
+              <w:bottom w:type="dxa" w:w="80"/>
+              <w:right w:type="dxa" w:w="110"/>
+            </w:tcMar>
+          </w:tcPr>
+          <w:p>
+            <w:pPr>
+              <w:spacing w:after="0"/>
+            </w:pPr>
+            <w:r>
+              <w:rPr>
+                <w:rFonts w:ascii="Calibri" w:cs="Calibri" w:eastAsia="Calibri" w:hAnsi="Calibri"/>
+                <w:sz w:val="20"/>
+                <w:szCs w:val="20"/>
+              </w:rPr>
+              <w:t xml:space="preserve"/>
+            </w:r>
+          </w:p>
+        </w:tc>
+      </w:tr>
+      <w:tr>
+        <w:trPr>
+          <w:cantSplit/>
+        </w:trPr>
+        <w:tc>
+          <w:tcPr>
+            <w:tcW w:type="dxa" w:w="700"/>
+            <w:tcBorders>
+              <w:top w:val="single" w:color="C9D3CD" w:sz="4"/>
+              <w:left w:val="single" w:color="C9D3CD" w:sz="4"/>
+              <w:bottom w:val="single" w:color="C9D3CD" w:sz="4"/>
+              <w:right w:val="single" w:color="C9D3CD" w:sz="4"/>
+            </w:tcBorders>
+            <w:shd w:fill="FFFFFF" w:color="auto" w:val="clear"/>
+            <w:tcMar>
+              <w:top w:type="dxa" w:w="80"/>
+              <w:left w:type="dxa" w:w="110"/>
+              <w:bottom w:type="dxa" w:w="80"/>
+              <w:right w:type="dxa" w:w="110"/>
+            </w:tcMar>
+          </w:tcPr>
+          <w:p>
+            <w:pPr>
+              <w:spacing w:after="0"/>
+            </w:pPr>
+            <w:r>
+              <w:rPr>
+                <w:rFonts w:ascii="Calibri" w:cs="Calibri" w:eastAsia="Calibri" w:hAnsi="Calibri"/>
+                <w:sz w:val="20"/>
+                <w:szCs w:val="20"/>
+              </w:rPr>
+              <w:t xml:space="preserve">I6</w:t>
+            </w:r>
+          </w:p>
+        </w:tc>
+        <w:tc>
+          <w:tcPr>
+            <w:tcW w:type="dxa" w:w="5438"/>
+            <w:tcBorders>
+              <w:top w:val="single" w:color="C9D3CD" w:sz="4"/>
+              <w:left w:val="single" w:color="C9D3CD" w:sz="4"/>
+              <w:bottom w:val="single" w:color="C9D3CD" w:sz="4"/>
+              <w:right w:val="single" w:color="C9D3CD" w:sz="4"/>
+            </w:tcBorders>
+            <w:shd w:fill="FFFFFF" w:color="auto" w:val="clear"/>
+            <w:tcMar>
+              <w:top w:type="dxa" w:w="80"/>
+              <w:left w:type="dxa" w:w="110"/>
+              <w:bottom w:type="dxa" w:w="80"/>
+              <w:right w:type="dxa" w:w="110"/>
+            </w:tcMar>
+          </w:tcPr>
+          <w:p>
+            <w:pPr>
+              <w:spacing w:after="0"/>
+            </w:pPr>
+            <w:r>
+              <w:rPr>
+                <w:rFonts w:ascii="Calibri" w:cs="Calibri" w:eastAsia="Calibri" w:hAnsi="Calibri"/>
+                <w:sz w:val="20"/>
+                <w:szCs w:val="20"/>
+              </w:rPr>
+              <w:t xml:space="preserve">Which regular reports are produced for the Board, Cabinet or partners, and how are they compiled today?</w:t>
+            </w:r>
+          </w:p>
+        </w:tc>
+        <w:tc>
+          <w:tcPr>
+            <w:tcW w:type="dxa" w:w="3500"/>
+            <w:tcBorders>
+              <w:top w:val="single" w:color="C9D3CD" w:sz="4"/>
+              <w:left w:val="single" w:color="C9D3CD" w:sz="4"/>
+              <w:bottom w:val="single" w:color="C9D3CD" w:sz="4"/>
+              <w:right w:val="single" w:color="C9D3CD" w:sz="4"/>
+            </w:tcBorders>
+            <w:shd w:fill="FFFFFF" w:color="auto" w:val="clear"/>
+            <w:tcMar>
+              <w:top w:type="dxa" w:w="80"/>
+              <w:left w:type="dxa" w:w="110"/>
+              <w:bottom w:type="dxa" w:w="80"/>
+              <w:right w:type="dxa" w:w="110"/>
+            </w:tcMar>
+          </w:tcPr>
+          <w:p>
+            <w:pPr>
+              <w:spacing w:after="0"/>
+            </w:pPr>
+            <w:r>
+              <w:rPr>
+                <w:rFonts w:ascii="Calibri" w:cs="Calibri" w:eastAsia="Calibri" w:hAnsi="Calibri"/>
+                <w:sz w:val="20"/>
+                <w:szCs w:val="20"/>
+              </w:rPr>
+              <w:t xml:space="preserve"/>
+            </w:r>
+          </w:p>
+        </w:tc>
+      </w:tr>
+      <w:tr>
+        <w:trPr>
+          <w:cantSplit/>
+        </w:trPr>
+        <w:tc>
+          <w:tcPr>
+            <w:tcW w:type="dxa" w:w="700"/>
+            <w:tcBorders>
+              <w:top w:val="single" w:color="C9D3CD" w:sz="4"/>
+              <w:left w:val="single" w:color="C9D3CD" w:sz="4"/>
+              <w:bottom w:val="single" w:color="C9D3CD" w:sz="4"/>
+              <w:right w:val="single" w:color="C9D3CD" w:sz="4"/>
+            </w:tcBorders>
+            <w:shd w:fill="FAFBFA" w:color="auto" w:val="clear"/>
+            <w:tcMar>
+              <w:top w:type="dxa" w:w="80"/>
+              <w:left w:type="dxa" w:w="110"/>
+              <w:bottom w:type="dxa" w:w="80"/>
+              <w:right w:type="dxa" w:w="110"/>
+            </w:tcMar>
+          </w:tcPr>
+          <w:p>
+            <w:pPr>
+              <w:spacing w:after="0"/>
+            </w:pPr>
+            <w:r>
+              <w:rPr>
+                <w:rFonts w:ascii="Calibri" w:cs="Calibri" w:eastAsia="Calibri" w:hAnsi="Calibri"/>
+                <w:sz w:val="20"/>
+                <w:szCs w:val="20"/>
+              </w:rPr>
+              <w:t xml:space="preserve">I7</w:t>
+            </w:r>
+          </w:p>
+        </w:tc>
+        <w:tc>
+          <w:tcPr>
+            <w:tcW w:type="dxa" w:w="5438"/>
+            <w:tcBorders>
+              <w:top w:val="single" w:color="C9D3CD" w:sz="4"/>
+              <w:left w:val="single" w:color="C9D3CD" w:sz="4"/>
+              <w:bottom w:val="single" w:color="C9D3CD" w:sz="4"/>
+              <w:right w:val="single" w:color="C9D3CD" w:sz="4"/>
+            </w:tcBorders>
+            <w:shd w:fill="FAFBFA" w:color="auto" w:val="clear"/>
+            <w:tcMar>
+              <w:top w:type="dxa" w:w="80"/>
+              <w:left w:type="dxa" w:w="110"/>
+              <w:bottom w:type="dxa" w:w="80"/>
+              <w:right w:type="dxa" w:w="110"/>
+            </w:tcMar>
+          </w:tcPr>
+          <w:p>
+            <w:pPr>
+              <w:spacing w:after="0"/>
+            </w:pPr>
+            <w:r>
+              <w:rPr>
+                <w:rFonts w:ascii="Calibri" w:cs="Calibri" w:eastAsia="Calibri" w:hAnsi="Calibri"/>
+                <w:sz w:val="20"/>
+                <w:szCs w:val="20"/>
+              </w:rPr>
+              <w:t xml:space="preserve">Where do current processes cause the most delay, rework or duplication?</w:t>
+            </w:r>
+          </w:p>
+        </w:tc>
+        <w:tc>
+          <w:tcPr>
+            <w:tcW w:type="dxa" w:w="3500"/>
+            <w:tcBorders>
+              <w:top w:val="single" w:color="C9D3CD" w:sz="4"/>
+              <w:left w:val="single" w:color="C9D3CD" w:sz="4"/>
+              <w:bottom w:val="single" w:color="C9D3CD" w:sz="4"/>
+              <w:right w:val="single" w:color="C9D3CD" w:sz="4"/>
+            </w:tcBorders>
+            <w:shd w:fill="FAFBFA" w:color="auto" w:val="clear"/>
+            <w:tcMar>
+              <w:top w:type="dxa" w:w="80"/>
+              <w:left w:type="dxa" w:w="110"/>
+              <w:bottom w:type="dxa" w:w="80"/>
+              <w:right w:type="dxa" w:w="110"/>
+            </w:tcMar>
+          </w:tcPr>
+          <w:p>
+            <w:pPr>
+              <w:spacing w:after="0"/>
+            </w:pPr>
+            <w:r>
+              <w:rPr>
+                <w:rFonts w:ascii="Calibri" w:cs="Calibri" w:eastAsia="Calibri" w:hAnsi="Calibri"/>
+                <w:sz w:val="20"/>
+                <w:szCs w:val="20"/>
+              </w:rPr>
+              <w:t xml:space="preserve"/>
+            </w:r>
+          </w:p>
+        </w:tc>
+      </w:tr>
+      <w:tr>
+        <w:trPr>
+          <w:cantSplit/>
+        </w:trPr>
+        <w:tc>
+          <w:tcPr>
+            <w:tcW w:type="dxa" w:w="700"/>
+            <w:tcBorders>
+              <w:top w:val="single" w:color="C9D3CD" w:sz="4"/>
+              <w:left w:val="single" w:color="C9D3CD" w:sz="4"/>
+              <w:bottom w:val="single" w:color="C9D3CD" w:sz="4"/>
+              <w:right w:val="single" w:color="C9D3CD" w:sz="4"/>
+            </w:tcBorders>
+            <w:shd w:fill="FFFFFF" w:color="auto" w:val="clear"/>
+            <w:tcMar>
+              <w:top w:type="dxa" w:w="80"/>
+              <w:left w:type="dxa" w:w="110"/>
+              <w:bottom w:type="dxa" w:w="80"/>
+              <w:right w:type="dxa" w:w="110"/>
+            </w:tcMar>
+          </w:tcPr>
+          <w:p>
+            <w:pPr>
+              <w:spacing w:after="0"/>
+            </w:pPr>
+            <w:r>
+              <w:rPr>
+                <w:rFonts w:ascii="Calibri" w:cs="Calibri" w:eastAsia="Calibri" w:hAnsi="Calibri"/>
+                <w:sz w:val="20"/>
+                <w:szCs w:val="20"/>
+              </w:rPr>
+              <w:t xml:space="preserve">I8</w:t>
+            </w:r>
+          </w:p>
+        </w:tc>
+        <w:tc>
+          <w:tcPr>
+            <w:tcW w:type="dxa" w:w="5438"/>
+            <w:tcBorders>
+              <w:top w:val="single" w:color="C9D3CD" w:sz="4"/>
+              <w:left w:val="single" w:color="C9D3CD" w:sz="4"/>
+              <w:bottom w:val="single" w:color="C9D3CD" w:sz="4"/>
+              <w:right w:val="single" w:color="C9D3CD" w:sz="4"/>
+            </w:tcBorders>
+            <w:shd w:fill="FFFFFF" w:color="auto" w:val="clear"/>
+            <w:tcMar>
+              <w:top w:type="dxa" w:w="80"/>
+              <w:left w:type="dxa" w:w="110"/>
+              <w:bottom w:type="dxa" w:w="80"/>
+              <w:right w:type="dxa" w:w="110"/>
+            </w:tcMar>
+          </w:tcPr>
+          <w:p>
+            <w:pPr>
+              <w:spacing w:after="0"/>
+            </w:pPr>
+            <w:r>
+              <w:rPr>
+                <w:rFonts w:ascii="Calibri" w:cs="Calibri" w:eastAsia="Calibri" w:hAnsi="Calibri"/>
+                <w:sz w:val="20"/>
+                <w:szCs w:val="20"/>
+              </w:rPr>
+              <w:t xml:space="preserve">Are any processes under review or planned to change that the platform should anticipate?</w:t>
+            </w:r>
+          </w:p>
+        </w:tc>
+        <w:tc>
+          <w:tcPr>
+            <w:tcW w:type="dxa" w:w="3500"/>
+            <w:tcBorders>
+              <w:top w:val="single" w:color="C9D3CD" w:sz="4"/>
+              <w:left w:val="single" w:color="C9D3CD" w:sz="4"/>
+              <w:bottom w:val="single" w:color="C9D3CD" w:sz="4"/>
+              <w:right w:val="single" w:color="C9D3CD" w:sz="4"/>
+            </w:tcBorders>
+            <w:shd w:fill="FFFFFF" w:color="auto" w:val="clear"/>
+            <w:tcMar>
+              <w:top w:type="dxa" w:w="80"/>
+              <w:left w:type="dxa" w:w="110"/>
+              <w:bottom w:type="dxa" w:w="80"/>
+              <w:right w:type="dxa" w:w="110"/>
+            </w:tcMar>
+          </w:tcPr>
+          <w:p>
+            <w:pPr>
+              <w:spacing w:after="0"/>
+            </w:pPr>
+            <w:r>
+              <w:rPr>
+                <w:rFonts w:ascii="Calibri" w:cs="Calibri" w:eastAsia="Calibri" w:hAnsi="Calibri"/>
+                <w:sz w:val="20"/>
+                <w:szCs w:val="20"/>
+              </w:rPr>
+              <w:t xml:space="preserve"/>
+            </w:r>
+          </w:p>
+        </w:tc>
+      </w:tr>
+    </w:tbl>
+    <w:p>
+      <w:pPr>
+        <w:pStyle w:val="Heading1"/>
+        <w:keepNext/>
+        <w:pBdr>
+          <w:bottom w:val="single" w:color="B8860B" w:sz="6" w:space="4"/>
+        </w:pBdr>
+        <w:spacing w:after="120" w:before="360"/>
+      </w:pPr>
+      <w:r>
+        <w:rPr>
+          <w:rFonts w:ascii="Calibri" w:cs="Calibri" w:eastAsia="Calibri" w:hAnsi="Calibri"/>
+          <w:b/>
+          <w:bCs/>
+          <w:color w:val="14532D"/>
+          <w:sz w:val="28"/>
+          <w:szCs w:val="28"/>
+        </w:rPr>
+        <w:t xml:space="preserve">J.  Team Capability, Support and Operating Model</w:t>
       </w:r>
     </w:p>
     <w:p>
@@ -9836,7 +10825,7 @@
                 <w:sz w:val="20"/>
                 <w:szCs w:val="20"/>
               </w:rPr>
-              <w:t xml:space="preserve">I1</w:t>
+              <w:t xml:space="preserve">J1</w:t>
             </w:r>
           </w:p>
         </w:tc>
@@ -9934,7 +10923,7 @@
                 <w:sz w:val="20"/>
                 <w:szCs w:val="20"/>
               </w:rPr>
-              <w:t xml:space="preserve">I2</w:t>
+              <w:t xml:space="preserve">J2</w:t>
             </w:r>
           </w:p>
         </w:tc>
@@ -10032,7 +11021,7 @@
                 <w:sz w:val="20"/>
                 <w:szCs w:val="20"/>
               </w:rPr>
-              <w:t xml:space="preserve">I3</w:t>
+              <w:t xml:space="preserve">J3</w:t>
             </w:r>
           </w:p>
         </w:tc>
@@ -10130,7 +11119,7 @@
                 <w:sz w:val="20"/>
                 <w:szCs w:val="20"/>
               </w:rPr>
-              <w:t xml:space="preserve">I4</w:t>
+              <w:t xml:space="preserve">J4</w:t>
             </w:r>
           </w:p>
         </w:tc>
@@ -10228,7 +11217,7 @@
                 <w:sz w:val="20"/>
                 <w:szCs w:val="20"/>
               </w:rPr>
-              <w:t xml:space="preserve">I5</w:t>
+              <w:t xml:space="preserve">J5</w:t>
             </w:r>
           </w:p>
         </w:tc>
@@ -10326,7 +11315,7 @@
                 <w:sz w:val="20"/>
                 <w:szCs w:val="20"/>
               </w:rPr>
-              <w:t xml:space="preserve">I6</w:t>
+              <w:t xml:space="preserve">J6</w:t>
             </w:r>
           </w:p>
         </w:tc>
@@ -10424,7 +11413,7 @@
                 <w:sz w:val="20"/>
                 <w:szCs w:val="20"/>
               </w:rPr>
-              <w:t xml:space="preserve">I7</w:t>
+              <w:t xml:space="preserve">J7</w:t>
             </w:r>
           </w:p>
         </w:tc>
@@ -10510,7 +11499,7 @@
           <w:sz w:val="28"/>
           <w:szCs w:val="28"/>
         </w:rPr>
-        <w:t xml:space="preserve">J.  Success Measures and Assurance</w:t>
+        <w:t xml:space="preserve">K.  Success Measures and Assurance</w:t>
       </w:r>
     </w:p>
     <w:p>
@@ -10727,7 +11716,7 @@
                 <w:sz w:val="20"/>
                 <w:szCs w:val="20"/>
               </w:rPr>
-              <w:t xml:space="preserve">J1</w:t>
+              <w:t xml:space="preserve">K1</w:t>
             </w:r>
           </w:p>
         </w:tc>
@@ -10825,7 +11814,7 @@
                 <w:sz w:val="20"/>
                 <w:szCs w:val="20"/>
               </w:rPr>
-              <w:t xml:space="preserve">J2</w:t>
+              <w:t xml:space="preserve">K2</w:t>
             </w:r>
           </w:p>
         </w:tc>
@@ -10923,7 +11912,7 @@
                 <w:sz w:val="20"/>
                 <w:szCs w:val="20"/>
               </w:rPr>
-              <w:t xml:space="preserve">J3</w:t>
+              <w:t xml:space="preserve">K3</w:t>
             </w:r>
           </w:p>
         </w:tc>
@@ -11027,7 +12016,7 @@
           <w:sz w:val="21"/>
           <w:szCs w:val="21"/>
         </w:rPr>
-        <w:t xml:space="preserve">ZIDA returns the completed questionnaire, Annex A and Annex B by the date shown on the cover page.</w:t>
+        <w:t xml:space="preserve">ZIDA returns the completed questionnaire and Annexes A, B and C by the date shown on the cover page.</w:t>
       </w:r>
     </w:p>
     <w:p>
@@ -11063,7 +12052,7 @@
           <w:sz w:val="21"/>
           <w:szCs w:val="21"/>
         </w:rPr>
-        <w:t xml:space="preserve">Afronovation presents costed acquisition options (Managed Service, Hybrid and Government-Operated), with implementation timeline and service levels.</w:t>
+        <w:t xml:space="preserve">Afronovation presents costed acquisition options (Managed Service, Hybrid and Government-Operated), with implementation timeline and service levels, together with a fit-gap summary of the processes and documents listed in Annex C.</w:t>
       </w:r>
     </w:p>
     <w:p>
@@ -16774,6 +17763,3161 @@
         </w:tc>
       </w:tr>
     </w:tbl>
+    <w:p>
+      <w:r>
+        <w:br w:type="page"/>
+      </w:r>
+    </w:p>
+    <w:p>
+      <w:pPr>
+        <w:pStyle w:val="Heading1"/>
+        <w:keepNext/>
+        <w:pBdr>
+          <w:bottom w:val="single" w:color="B8860B" w:sz="6" w:space="4"/>
+        </w:pBdr>
+        <w:spacing w:after="120" w:before="360"/>
+      </w:pPr>
+      <w:r>
+        <w:rPr>
+          <w:rFonts w:ascii="Calibri" w:cs="Calibri" w:eastAsia="Calibri" w:hAnsi="Calibri"/>
+          <w:b/>
+          <w:bCs/>
+          <w:color w:val="14532D"/>
+          <w:sz w:val="28"/>
+          <w:szCs w:val="28"/>
+        </w:rPr>
+        <w:t xml:space="preserve">Annex C — Process and Document Register</w:t>
+      </w:r>
+    </w:p>
+    <w:p>
+      <w:pPr>
+        <w:keepNext/>
+        <w:spacing w:after="120" w:line="276"/>
+      </w:pPr>
+      <w:r>
+        <w:rPr>
+          <w:rFonts w:ascii="Calibri" w:cs="Calibri" w:eastAsia="Calibri" w:hAnsi="Calibri"/>
+          <w:i/>
+          <w:iCs/>
+          <w:color w:val="5F6B66"/>
+          <w:sz w:val="21"/>
+          <w:szCs w:val="21"/>
+        </w:rPr>
+        <w:t xml:space="preserve">One row per process, form, template, checklist, scoring model or report. Lifecycle stage: onboarding, scoring, approval, investor, aftercare or reporting. Current format: paper, Word, Excel or system.</w:t>
+      </w:r>
+    </w:p>
+    <w:tbl>
+      <w:tblPr>
+        <w:tblW w:type="dxa" w:w="9638"/>
+        <w:tblBorders>
+          <w:top w:val="single" w:color="auto" w:sz="4"/>
+          <w:left w:val="single" w:color="auto" w:sz="4"/>
+          <w:bottom w:val="single" w:color="auto" w:sz="4"/>
+          <w:right w:val="single" w:color="auto" w:sz="4"/>
+          <w:insideH w:val="single" w:color="auto" w:sz="4"/>
+          <w:insideV w:val="single" w:color="auto" w:sz="4"/>
+        </w:tblBorders>
+        <w:tblLayout w:type="fixed"/>
+      </w:tblPr>
+      <w:tblGrid>
+        <w:gridCol w:w="1900"/>
+        <w:gridCol w:w="2300"/>
+        <w:gridCol w:w="1500"/>
+        <w:gridCol w:w="1300"/>
+        <w:gridCol w:w="1438"/>
+        <w:gridCol w:w="1200"/>
+      </w:tblGrid>
+      <w:tr>
+        <w:trPr>
+          <w:tblHeader/>
+        </w:trPr>
+        <w:tc>
+          <w:tcPr>
+            <w:tcW w:type="dxa" w:w="1900"/>
+            <w:tcBorders>
+              <w:top w:val="single" w:color="C9D3CD" w:sz="4"/>
+              <w:left w:val="single" w:color="C9D3CD" w:sz="4"/>
+              <w:bottom w:val="single" w:color="C9D3CD" w:sz="4"/>
+              <w:right w:val="single" w:color="C9D3CD" w:sz="4"/>
+            </w:tcBorders>
+            <w:shd w:fill="14532D" w:color="auto" w:val="clear"/>
+            <w:tcMar>
+              <w:top w:type="dxa" w:w="80"/>
+              <w:left w:type="dxa" w:w="110"/>
+              <w:bottom w:type="dxa" w:w="80"/>
+              <w:right w:type="dxa" w:w="110"/>
+            </w:tcMar>
+          </w:tcPr>
+          <w:p>
+            <w:pPr>
+              <w:spacing w:after="0"/>
+            </w:pPr>
+            <w:r>
+              <w:rPr>
+                <w:rFonts w:ascii="Calibri" w:cs="Calibri" w:eastAsia="Calibri" w:hAnsi="Calibri"/>
+                <w:b/>
+                <w:bCs/>
+                <w:color w:val="FFFFFF"/>
+                <w:sz w:val="19"/>
+                <w:szCs w:val="19"/>
+              </w:rPr>
+              <w:t xml:space="preserve">Document or process name</w:t>
+            </w:r>
+          </w:p>
+        </w:tc>
+        <w:tc>
+          <w:tcPr>
+            <w:tcW w:type="dxa" w:w="2300"/>
+            <w:tcBorders>
+              <w:top w:val="single" w:color="C9D3CD" w:sz="4"/>
+              <w:left w:val="single" w:color="C9D3CD" w:sz="4"/>
+              <w:bottom w:val="single" w:color="C9D3CD" w:sz="4"/>
+              <w:right w:val="single" w:color="C9D3CD" w:sz="4"/>
+            </w:tcBorders>
+            <w:shd w:fill="14532D" w:color="auto" w:val="clear"/>
+            <w:tcMar>
+              <w:top w:type="dxa" w:w="80"/>
+              <w:left w:type="dxa" w:w="110"/>
+              <w:bottom w:type="dxa" w:w="80"/>
+              <w:right w:type="dxa" w:w="110"/>
+            </w:tcMar>
+          </w:tcPr>
+          <w:p>
+            <w:pPr>
+              <w:spacing w:after="0"/>
+            </w:pPr>
+            <w:r>
+              <w:rPr>
+                <w:rFonts w:ascii="Calibri" w:cs="Calibri" w:eastAsia="Calibri" w:hAnsi="Calibri"/>
+                <w:b/>
+                <w:bCs/>
+                <w:color w:val="FFFFFF"/>
+                <w:sz w:val="19"/>
+                <w:szCs w:val="19"/>
+              </w:rPr>
+              <w:t xml:space="preserve">Purpose</w:t>
+            </w:r>
+          </w:p>
+        </w:tc>
+        <w:tc>
+          <w:tcPr>
+            <w:tcW w:type="dxa" w:w="1500"/>
+            <w:tcBorders>
+              <w:top w:val="single" w:color="C9D3CD" w:sz="4"/>
+              <w:left w:val="single" w:color="C9D3CD" w:sz="4"/>
+              <w:bottom w:val="single" w:color="C9D3CD" w:sz="4"/>
+              <w:right w:val="single" w:color="C9D3CD" w:sz="4"/>
+            </w:tcBorders>
+            <w:shd w:fill="14532D" w:color="auto" w:val="clear"/>
+            <w:tcMar>
+              <w:top w:type="dxa" w:w="80"/>
+              <w:left w:type="dxa" w:w="110"/>
+              <w:bottom w:type="dxa" w:w="80"/>
+              <w:right w:type="dxa" w:w="110"/>
+            </w:tcMar>
+          </w:tcPr>
+          <w:p>
+            <w:pPr>
+              <w:spacing w:after="0"/>
+            </w:pPr>
+            <w:r>
+              <w:rPr>
+                <w:rFonts w:ascii="Calibri" w:cs="Calibri" w:eastAsia="Calibri" w:hAnsi="Calibri"/>
+                <w:b/>
+                <w:bCs/>
+                <w:color w:val="FFFFFF"/>
+                <w:sz w:val="19"/>
+                <w:szCs w:val="19"/>
+              </w:rPr>
+              <w:t xml:space="preserve">Lifecycle stage</w:t>
+            </w:r>
+          </w:p>
+        </w:tc>
+        <w:tc>
+          <w:tcPr>
+            <w:tcW w:type="dxa" w:w="1300"/>
+            <w:tcBorders>
+              <w:top w:val="single" w:color="C9D3CD" w:sz="4"/>
+              <w:left w:val="single" w:color="C9D3CD" w:sz="4"/>
+              <w:bottom w:val="single" w:color="C9D3CD" w:sz="4"/>
+              <w:right w:val="single" w:color="C9D3CD" w:sz="4"/>
+            </w:tcBorders>
+            <w:shd w:fill="14532D" w:color="auto" w:val="clear"/>
+            <w:tcMar>
+              <w:top w:type="dxa" w:w="80"/>
+              <w:left w:type="dxa" w:w="110"/>
+              <w:bottom w:type="dxa" w:w="80"/>
+              <w:right w:type="dxa" w:w="110"/>
+            </w:tcMar>
+          </w:tcPr>
+          <w:p>
+            <w:pPr>
+              <w:spacing w:after="0"/>
+            </w:pPr>
+            <w:r>
+              <w:rPr>
+                <w:rFonts w:ascii="Calibri" w:cs="Calibri" w:eastAsia="Calibri" w:hAnsi="Calibri"/>
+                <w:b/>
+                <w:bCs/>
+                <w:color w:val="FFFFFF"/>
+                <w:sz w:val="19"/>
+                <w:szCs w:val="19"/>
+              </w:rPr>
+              <w:t xml:space="preserve">Owner (unit)</w:t>
+            </w:r>
+          </w:p>
+        </w:tc>
+        <w:tc>
+          <w:tcPr>
+            <w:tcW w:type="dxa" w:w="1438"/>
+            <w:tcBorders>
+              <w:top w:val="single" w:color="C9D3CD" w:sz="4"/>
+              <w:left w:val="single" w:color="C9D3CD" w:sz="4"/>
+              <w:bottom w:val="single" w:color="C9D3CD" w:sz="4"/>
+              <w:right w:val="single" w:color="C9D3CD" w:sz="4"/>
+            </w:tcBorders>
+            <w:shd w:fill="14532D" w:color="auto" w:val="clear"/>
+            <w:tcMar>
+              <w:top w:type="dxa" w:w="80"/>
+              <w:left w:type="dxa" w:w="110"/>
+              <w:bottom w:type="dxa" w:w="80"/>
+              <w:right w:type="dxa" w:w="110"/>
+            </w:tcMar>
+          </w:tcPr>
+          <w:p>
+            <w:pPr>
+              <w:spacing w:after="0"/>
+            </w:pPr>
+            <w:r>
+              <w:rPr>
+                <w:rFonts w:ascii="Calibri" w:cs="Calibri" w:eastAsia="Calibri" w:hAnsi="Calibri"/>
+                <w:b/>
+                <w:bCs/>
+                <w:color w:val="FFFFFF"/>
+                <w:sz w:val="19"/>
+                <w:szCs w:val="19"/>
+              </w:rPr>
+              <w:t xml:space="preserve">Current format</w:t>
+            </w:r>
+          </w:p>
+        </w:tc>
+        <w:tc>
+          <w:tcPr>
+            <w:tcW w:type="dxa" w:w="1200"/>
+            <w:tcBorders>
+              <w:top w:val="single" w:color="C9D3CD" w:sz="4"/>
+              <w:left w:val="single" w:color="C9D3CD" w:sz="4"/>
+              <w:bottom w:val="single" w:color="C9D3CD" w:sz="4"/>
+              <w:right w:val="single" w:color="C9D3CD" w:sz="4"/>
+            </w:tcBorders>
+            <w:shd w:fill="14532D" w:color="auto" w:val="clear"/>
+            <w:tcMar>
+              <w:top w:type="dxa" w:w="80"/>
+              <w:left w:type="dxa" w:w="110"/>
+              <w:bottom w:type="dxa" w:w="80"/>
+              <w:right w:type="dxa" w:w="110"/>
+            </w:tcMar>
+          </w:tcPr>
+          <w:p>
+            <w:pPr>
+              <w:spacing w:after="0"/>
+            </w:pPr>
+            <w:r>
+              <w:rPr>
+                <w:rFonts w:ascii="Calibri" w:cs="Calibri" w:eastAsia="Calibri" w:hAnsi="Calibri"/>
+                <w:b/>
+                <w:bCs/>
+                <w:color w:val="FFFFFF"/>
+                <w:sz w:val="19"/>
+                <w:szCs w:val="19"/>
+              </w:rPr>
+              <w:t xml:space="preserve">Sample attached (Y/N)</w:t>
+            </w:r>
+          </w:p>
+        </w:tc>
+      </w:tr>
+      <w:tr>
+        <w:trPr>
+          <w:cantSplit/>
+        </w:trPr>
+        <w:tc>
+          <w:tcPr>
+            <w:tcW w:type="dxa" w:w="1900"/>
+            <w:tcBorders>
+              <w:top w:val="single" w:color="C9D3CD" w:sz="4"/>
+              <w:left w:val="single" w:color="C9D3CD" w:sz="4"/>
+              <w:bottom w:val="single" w:color="C9D3CD" w:sz="4"/>
+              <w:right w:val="single" w:color="C9D3CD" w:sz="4"/>
+            </w:tcBorders>
+            <w:shd w:fill="FAFBFA" w:color="auto" w:val="clear"/>
+            <w:tcMar>
+              <w:top w:type="dxa" w:w="80"/>
+              <w:left w:type="dxa" w:w="110"/>
+              <w:bottom w:type="dxa" w:w="80"/>
+              <w:right w:type="dxa" w:w="110"/>
+            </w:tcMar>
+          </w:tcPr>
+          <w:p>
+            <w:pPr>
+              <w:spacing w:after="0"/>
+            </w:pPr>
+            <w:r>
+              <w:rPr>
+                <w:rFonts w:ascii="Calibri" w:cs="Calibri" w:eastAsia="Calibri" w:hAnsi="Calibri"/>
+                <w:sz w:val="20"/>
+                <w:szCs w:val="20"/>
+              </w:rPr>
+              <w:t xml:space="preserve"/>
+            </w:r>
+          </w:p>
+        </w:tc>
+        <w:tc>
+          <w:tcPr>
+            <w:tcW w:type="dxa" w:w="2300"/>
+            <w:tcBorders>
+              <w:top w:val="single" w:color="C9D3CD" w:sz="4"/>
+              <w:left w:val="single" w:color="C9D3CD" w:sz="4"/>
+              <w:bottom w:val="single" w:color="C9D3CD" w:sz="4"/>
+              <w:right w:val="single" w:color="C9D3CD" w:sz="4"/>
+            </w:tcBorders>
+            <w:shd w:fill="FAFBFA" w:color="auto" w:val="clear"/>
+            <w:tcMar>
+              <w:top w:type="dxa" w:w="80"/>
+              <w:left w:type="dxa" w:w="110"/>
+              <w:bottom w:type="dxa" w:w="80"/>
+              <w:right w:type="dxa" w:w="110"/>
+            </w:tcMar>
+          </w:tcPr>
+          <w:p>
+            <w:pPr>
+              <w:spacing w:after="0"/>
+            </w:pPr>
+            <w:r>
+              <w:rPr>
+                <w:rFonts w:ascii="Calibri" w:cs="Calibri" w:eastAsia="Calibri" w:hAnsi="Calibri"/>
+                <w:sz w:val="20"/>
+                <w:szCs w:val="20"/>
+              </w:rPr>
+              <w:t xml:space="preserve"/>
+            </w:r>
+          </w:p>
+        </w:tc>
+        <w:tc>
+          <w:tcPr>
+            <w:tcW w:type="dxa" w:w="1500"/>
+            <w:tcBorders>
+              <w:top w:val="single" w:color="C9D3CD" w:sz="4"/>
+              <w:left w:val="single" w:color="C9D3CD" w:sz="4"/>
+              <w:bottom w:val="single" w:color="C9D3CD" w:sz="4"/>
+              <w:right w:val="single" w:color="C9D3CD" w:sz="4"/>
+            </w:tcBorders>
+            <w:shd w:fill="FAFBFA" w:color="auto" w:val="clear"/>
+            <w:tcMar>
+              <w:top w:type="dxa" w:w="80"/>
+              <w:left w:type="dxa" w:w="110"/>
+              <w:bottom w:type="dxa" w:w="80"/>
+              <w:right w:type="dxa" w:w="110"/>
+            </w:tcMar>
+          </w:tcPr>
+          <w:p>
+            <w:pPr>
+              <w:spacing w:after="0"/>
+            </w:pPr>
+            <w:r>
+              <w:rPr>
+                <w:rFonts w:ascii="Calibri" w:cs="Calibri" w:eastAsia="Calibri" w:hAnsi="Calibri"/>
+                <w:sz w:val="20"/>
+                <w:szCs w:val="20"/>
+              </w:rPr>
+              <w:t xml:space="preserve"/>
+            </w:r>
+          </w:p>
+        </w:tc>
+        <w:tc>
+          <w:tcPr>
+            <w:tcW w:type="dxa" w:w="1300"/>
+            <w:tcBorders>
+              <w:top w:val="single" w:color="C9D3CD" w:sz="4"/>
+              <w:left w:val="single" w:color="C9D3CD" w:sz="4"/>
+              <w:bottom w:val="single" w:color="C9D3CD" w:sz="4"/>
+              <w:right w:val="single" w:color="C9D3CD" w:sz="4"/>
+            </w:tcBorders>
+            <w:shd w:fill="FAFBFA" w:color="auto" w:val="clear"/>
+            <w:tcMar>
+              <w:top w:type="dxa" w:w="80"/>
+              <w:left w:type="dxa" w:w="110"/>
+              <w:bottom w:type="dxa" w:w="80"/>
+              <w:right w:type="dxa" w:w="110"/>
+            </w:tcMar>
+          </w:tcPr>
+          <w:p>
+            <w:pPr>
+              <w:spacing w:after="0"/>
+            </w:pPr>
+            <w:r>
+              <w:rPr>
+                <w:rFonts w:ascii="Calibri" w:cs="Calibri" w:eastAsia="Calibri" w:hAnsi="Calibri"/>
+                <w:sz w:val="20"/>
+                <w:szCs w:val="20"/>
+              </w:rPr>
+              <w:t xml:space="preserve"/>
+            </w:r>
+          </w:p>
+        </w:tc>
+        <w:tc>
+          <w:tcPr>
+            <w:tcW w:type="dxa" w:w="1438"/>
+            <w:tcBorders>
+              <w:top w:val="single" w:color="C9D3CD" w:sz="4"/>
+              <w:left w:val="single" w:color="C9D3CD" w:sz="4"/>
+              <w:bottom w:val="single" w:color="C9D3CD" w:sz="4"/>
+              <w:right w:val="single" w:color="C9D3CD" w:sz="4"/>
+            </w:tcBorders>
+            <w:shd w:fill="FAFBFA" w:color="auto" w:val="clear"/>
+            <w:tcMar>
+              <w:top w:type="dxa" w:w="80"/>
+              <w:left w:type="dxa" w:w="110"/>
+              <w:bottom w:type="dxa" w:w="80"/>
+              <w:right w:type="dxa" w:w="110"/>
+            </w:tcMar>
+          </w:tcPr>
+          <w:p>
+            <w:pPr>
+              <w:spacing w:after="0"/>
+            </w:pPr>
+            <w:r>
+              <w:rPr>
+                <w:rFonts w:ascii="Calibri" w:cs="Calibri" w:eastAsia="Calibri" w:hAnsi="Calibri"/>
+                <w:sz w:val="20"/>
+                <w:szCs w:val="20"/>
+              </w:rPr>
+              <w:t xml:space="preserve"/>
+            </w:r>
+          </w:p>
+        </w:tc>
+        <w:tc>
+          <w:tcPr>
+            <w:tcW w:type="dxa" w:w="1200"/>
+            <w:tcBorders>
+              <w:top w:val="single" w:color="C9D3CD" w:sz="4"/>
+              <w:left w:val="single" w:color="C9D3CD" w:sz="4"/>
+              <w:bottom w:val="single" w:color="C9D3CD" w:sz="4"/>
+              <w:right w:val="single" w:color="C9D3CD" w:sz="4"/>
+            </w:tcBorders>
+            <w:shd w:fill="FAFBFA" w:color="auto" w:val="clear"/>
+            <w:tcMar>
+              <w:top w:type="dxa" w:w="80"/>
+              <w:left w:type="dxa" w:w="110"/>
+              <w:bottom w:type="dxa" w:w="80"/>
+              <w:right w:type="dxa" w:w="110"/>
+            </w:tcMar>
+          </w:tcPr>
+          <w:p>
+            <w:pPr>
+              <w:spacing w:after="0"/>
+            </w:pPr>
+            <w:r>
+              <w:rPr>
+                <w:rFonts w:ascii="Calibri" w:cs="Calibri" w:eastAsia="Calibri" w:hAnsi="Calibri"/>
+                <w:sz w:val="20"/>
+                <w:szCs w:val="20"/>
+              </w:rPr>
+              <w:t xml:space="preserve"/>
+            </w:r>
+          </w:p>
+        </w:tc>
+      </w:tr>
+      <w:tr>
+        <w:trPr>
+          <w:cantSplit/>
+        </w:trPr>
+        <w:tc>
+          <w:tcPr>
+            <w:tcW w:type="dxa" w:w="1900"/>
+            <w:tcBorders>
+              <w:top w:val="single" w:color="C9D3CD" w:sz="4"/>
+              <w:left w:val="single" w:color="C9D3CD" w:sz="4"/>
+              <w:bottom w:val="single" w:color="C9D3CD" w:sz="4"/>
+              <w:right w:val="single" w:color="C9D3CD" w:sz="4"/>
+            </w:tcBorders>
+            <w:shd w:fill="FFFFFF" w:color="auto" w:val="clear"/>
+            <w:tcMar>
+              <w:top w:type="dxa" w:w="80"/>
+              <w:left w:type="dxa" w:w="110"/>
+              <w:bottom w:type="dxa" w:w="80"/>
+              <w:right w:type="dxa" w:w="110"/>
+            </w:tcMar>
+          </w:tcPr>
+          <w:p>
+            <w:pPr>
+              <w:spacing w:after="0"/>
+            </w:pPr>
+            <w:r>
+              <w:rPr>
+                <w:rFonts w:ascii="Calibri" w:cs="Calibri" w:eastAsia="Calibri" w:hAnsi="Calibri"/>
+                <w:sz w:val="20"/>
+                <w:szCs w:val="20"/>
+              </w:rPr>
+              <w:t xml:space="preserve"/>
+            </w:r>
+          </w:p>
+        </w:tc>
+        <w:tc>
+          <w:tcPr>
+            <w:tcW w:type="dxa" w:w="2300"/>
+            <w:tcBorders>
+              <w:top w:val="single" w:color="C9D3CD" w:sz="4"/>
+              <w:left w:val="single" w:color="C9D3CD" w:sz="4"/>
+              <w:bottom w:val="single" w:color="C9D3CD" w:sz="4"/>
+              <w:right w:val="single" w:color="C9D3CD" w:sz="4"/>
+            </w:tcBorders>
+            <w:shd w:fill="FFFFFF" w:color="auto" w:val="clear"/>
+            <w:tcMar>
+              <w:top w:type="dxa" w:w="80"/>
+              <w:left w:type="dxa" w:w="110"/>
+              <w:bottom w:type="dxa" w:w="80"/>
+              <w:right w:type="dxa" w:w="110"/>
+            </w:tcMar>
+          </w:tcPr>
+          <w:p>
+            <w:pPr>
+              <w:spacing w:after="0"/>
+            </w:pPr>
+            <w:r>
+              <w:rPr>
+                <w:rFonts w:ascii="Calibri" w:cs="Calibri" w:eastAsia="Calibri" w:hAnsi="Calibri"/>
+                <w:sz w:val="20"/>
+                <w:szCs w:val="20"/>
+              </w:rPr>
+              <w:t xml:space="preserve"/>
+            </w:r>
+          </w:p>
+        </w:tc>
+        <w:tc>
+          <w:tcPr>
+            <w:tcW w:type="dxa" w:w="1500"/>
+            <w:tcBorders>
+              <w:top w:val="single" w:color="C9D3CD" w:sz="4"/>
+              <w:left w:val="single" w:color="C9D3CD" w:sz="4"/>
+              <w:bottom w:val="single" w:color="C9D3CD" w:sz="4"/>
+              <w:right w:val="single" w:color="C9D3CD" w:sz="4"/>
+            </w:tcBorders>
+            <w:shd w:fill="FFFFFF" w:color="auto" w:val="clear"/>
+            <w:tcMar>
+              <w:top w:type="dxa" w:w="80"/>
+              <w:left w:type="dxa" w:w="110"/>
+              <w:bottom w:type="dxa" w:w="80"/>
+              <w:right w:type="dxa" w:w="110"/>
+            </w:tcMar>
+          </w:tcPr>
+          <w:p>
+            <w:pPr>
+              <w:spacing w:after="0"/>
+            </w:pPr>
+            <w:r>
+              <w:rPr>
+                <w:rFonts w:ascii="Calibri" w:cs="Calibri" w:eastAsia="Calibri" w:hAnsi="Calibri"/>
+                <w:sz w:val="20"/>
+                <w:szCs w:val="20"/>
+              </w:rPr>
+              <w:t xml:space="preserve"/>
+            </w:r>
+          </w:p>
+        </w:tc>
+        <w:tc>
+          <w:tcPr>
+            <w:tcW w:type="dxa" w:w="1300"/>
+            <w:tcBorders>
+              <w:top w:val="single" w:color="C9D3CD" w:sz="4"/>
+              <w:left w:val="single" w:color="C9D3CD" w:sz="4"/>
+              <w:bottom w:val="single" w:color="C9D3CD" w:sz="4"/>
+              <w:right w:val="single" w:color="C9D3CD" w:sz="4"/>
+            </w:tcBorders>
+            <w:shd w:fill="FFFFFF" w:color="auto" w:val="clear"/>
+            <w:tcMar>
+              <w:top w:type="dxa" w:w="80"/>
+              <w:left w:type="dxa" w:w="110"/>
+              <w:bottom w:type="dxa" w:w="80"/>
+              <w:right w:type="dxa" w:w="110"/>
+            </w:tcMar>
+          </w:tcPr>
+          <w:p>
+            <w:pPr>
+              <w:spacing w:after="0"/>
+            </w:pPr>
+            <w:r>
+              <w:rPr>
+                <w:rFonts w:ascii="Calibri" w:cs="Calibri" w:eastAsia="Calibri" w:hAnsi="Calibri"/>
+                <w:sz w:val="20"/>
+                <w:szCs w:val="20"/>
+              </w:rPr>
+              <w:t xml:space="preserve"/>
+            </w:r>
+          </w:p>
+        </w:tc>
+        <w:tc>
+          <w:tcPr>
+            <w:tcW w:type="dxa" w:w="1438"/>
+            <w:tcBorders>
+              <w:top w:val="single" w:color="C9D3CD" w:sz="4"/>
+              <w:left w:val="single" w:color="C9D3CD" w:sz="4"/>
+              <w:bottom w:val="single" w:color="C9D3CD" w:sz="4"/>
+              <w:right w:val="single" w:color="C9D3CD" w:sz="4"/>
+            </w:tcBorders>
+            <w:shd w:fill="FFFFFF" w:color="auto" w:val="clear"/>
+            <w:tcMar>
+              <w:top w:type="dxa" w:w="80"/>
+              <w:left w:type="dxa" w:w="110"/>
+              <w:bottom w:type="dxa" w:w="80"/>
+              <w:right w:type="dxa" w:w="110"/>
+            </w:tcMar>
+          </w:tcPr>
+          <w:p>
+            <w:pPr>
+              <w:spacing w:after="0"/>
+            </w:pPr>
+            <w:r>
+              <w:rPr>
+                <w:rFonts w:ascii="Calibri" w:cs="Calibri" w:eastAsia="Calibri" w:hAnsi="Calibri"/>
+                <w:sz w:val="20"/>
+                <w:szCs w:val="20"/>
+              </w:rPr>
+              <w:t xml:space="preserve"/>
+            </w:r>
+          </w:p>
+        </w:tc>
+        <w:tc>
+          <w:tcPr>
+            <w:tcW w:type="dxa" w:w="1200"/>
+            <w:tcBorders>
+              <w:top w:val="single" w:color="C9D3CD" w:sz="4"/>
+              <w:left w:val="single" w:color="C9D3CD" w:sz="4"/>
+              <w:bottom w:val="single" w:color="C9D3CD" w:sz="4"/>
+              <w:right w:val="single" w:color="C9D3CD" w:sz="4"/>
+            </w:tcBorders>
+            <w:shd w:fill="FFFFFF" w:color="auto" w:val="clear"/>
+            <w:tcMar>
+              <w:top w:type="dxa" w:w="80"/>
+              <w:left w:type="dxa" w:w="110"/>
+              <w:bottom w:type="dxa" w:w="80"/>
+              <w:right w:type="dxa" w:w="110"/>
+            </w:tcMar>
+          </w:tcPr>
+          <w:p>
+            <w:pPr>
+              <w:spacing w:after="0"/>
+            </w:pPr>
+            <w:r>
+              <w:rPr>
+                <w:rFonts w:ascii="Calibri" w:cs="Calibri" w:eastAsia="Calibri" w:hAnsi="Calibri"/>
+                <w:sz w:val="20"/>
+                <w:szCs w:val="20"/>
+              </w:rPr>
+              <w:t xml:space="preserve"/>
+            </w:r>
+          </w:p>
+        </w:tc>
+      </w:tr>
+      <w:tr>
+        <w:trPr>
+          <w:cantSplit/>
+        </w:trPr>
+        <w:tc>
+          <w:tcPr>
+            <w:tcW w:type="dxa" w:w="1900"/>
+            <w:tcBorders>
+              <w:top w:val="single" w:color="C9D3CD" w:sz="4"/>
+              <w:left w:val="single" w:color="C9D3CD" w:sz="4"/>
+              <w:bottom w:val="single" w:color="C9D3CD" w:sz="4"/>
+              <w:right w:val="single" w:color="C9D3CD" w:sz="4"/>
+            </w:tcBorders>
+            <w:shd w:fill="FAFBFA" w:color="auto" w:val="clear"/>
+            <w:tcMar>
+              <w:top w:type="dxa" w:w="80"/>
+              <w:left w:type="dxa" w:w="110"/>
+              <w:bottom w:type="dxa" w:w="80"/>
+              <w:right w:type="dxa" w:w="110"/>
+            </w:tcMar>
+          </w:tcPr>
+          <w:p>
+            <w:pPr>
+              <w:spacing w:after="0"/>
+            </w:pPr>
+            <w:r>
+              <w:rPr>
+                <w:rFonts w:ascii="Calibri" w:cs="Calibri" w:eastAsia="Calibri" w:hAnsi="Calibri"/>
+                <w:sz w:val="20"/>
+                <w:szCs w:val="20"/>
+              </w:rPr>
+              <w:t xml:space="preserve"/>
+            </w:r>
+          </w:p>
+        </w:tc>
+        <w:tc>
+          <w:tcPr>
+            <w:tcW w:type="dxa" w:w="2300"/>
+            <w:tcBorders>
+              <w:top w:val="single" w:color="C9D3CD" w:sz="4"/>
+              <w:left w:val="single" w:color="C9D3CD" w:sz="4"/>
+              <w:bottom w:val="single" w:color="C9D3CD" w:sz="4"/>
+              <w:right w:val="single" w:color="C9D3CD" w:sz="4"/>
+            </w:tcBorders>
+            <w:shd w:fill="FAFBFA" w:color="auto" w:val="clear"/>
+            <w:tcMar>
+              <w:top w:type="dxa" w:w="80"/>
+              <w:left w:type="dxa" w:w="110"/>
+              <w:bottom w:type="dxa" w:w="80"/>
+              <w:right w:type="dxa" w:w="110"/>
+            </w:tcMar>
+          </w:tcPr>
+          <w:p>
+            <w:pPr>
+              <w:spacing w:after="0"/>
+            </w:pPr>
+            <w:r>
+              <w:rPr>
+                <w:rFonts w:ascii="Calibri" w:cs="Calibri" w:eastAsia="Calibri" w:hAnsi="Calibri"/>
+                <w:sz w:val="20"/>
+                <w:szCs w:val="20"/>
+              </w:rPr>
+              <w:t xml:space="preserve"/>
+            </w:r>
+          </w:p>
+        </w:tc>
+        <w:tc>
+          <w:tcPr>
+            <w:tcW w:type="dxa" w:w="1500"/>
+            <w:tcBorders>
+              <w:top w:val="single" w:color="C9D3CD" w:sz="4"/>
+              <w:left w:val="single" w:color="C9D3CD" w:sz="4"/>
+              <w:bottom w:val="single" w:color="C9D3CD" w:sz="4"/>
+              <w:right w:val="single" w:color="C9D3CD" w:sz="4"/>
+            </w:tcBorders>
+            <w:shd w:fill="FAFBFA" w:color="auto" w:val="clear"/>
+            <w:tcMar>
+              <w:top w:type="dxa" w:w="80"/>
+              <w:left w:type="dxa" w:w="110"/>
+              <w:bottom w:type="dxa" w:w="80"/>
+              <w:right w:type="dxa" w:w="110"/>
+            </w:tcMar>
+          </w:tcPr>
+          <w:p>
+            <w:pPr>
+              <w:spacing w:after="0"/>
+            </w:pPr>
+            <w:r>
+              <w:rPr>
+                <w:rFonts w:ascii="Calibri" w:cs="Calibri" w:eastAsia="Calibri" w:hAnsi="Calibri"/>
+                <w:sz w:val="20"/>
+                <w:szCs w:val="20"/>
+              </w:rPr>
+              <w:t xml:space="preserve"/>
+            </w:r>
+          </w:p>
+        </w:tc>
+        <w:tc>
+          <w:tcPr>
+            <w:tcW w:type="dxa" w:w="1300"/>
+            <w:tcBorders>
+              <w:top w:val="single" w:color="C9D3CD" w:sz="4"/>
+              <w:left w:val="single" w:color="C9D3CD" w:sz="4"/>
+              <w:bottom w:val="single" w:color="C9D3CD" w:sz="4"/>
+              <w:right w:val="single" w:color="C9D3CD" w:sz="4"/>
+            </w:tcBorders>
+            <w:shd w:fill="FAFBFA" w:color="auto" w:val="clear"/>
+            <w:tcMar>
+              <w:top w:type="dxa" w:w="80"/>
+              <w:left w:type="dxa" w:w="110"/>
+              <w:bottom w:type="dxa" w:w="80"/>
+              <w:right w:type="dxa" w:w="110"/>
+            </w:tcMar>
+          </w:tcPr>
+          <w:p>
+            <w:pPr>
+              <w:spacing w:after="0"/>
+            </w:pPr>
+            <w:r>
+              <w:rPr>
+                <w:rFonts w:ascii="Calibri" w:cs="Calibri" w:eastAsia="Calibri" w:hAnsi="Calibri"/>
+                <w:sz w:val="20"/>
+                <w:szCs w:val="20"/>
+              </w:rPr>
+              <w:t xml:space="preserve"/>
+            </w:r>
+          </w:p>
+        </w:tc>
+        <w:tc>
+          <w:tcPr>
+            <w:tcW w:type="dxa" w:w="1438"/>
+            <w:tcBorders>
+              <w:top w:val="single" w:color="C9D3CD" w:sz="4"/>
+              <w:left w:val="single" w:color="C9D3CD" w:sz="4"/>
+              <w:bottom w:val="single" w:color="C9D3CD" w:sz="4"/>
+              <w:right w:val="single" w:color="C9D3CD" w:sz="4"/>
+            </w:tcBorders>
+            <w:shd w:fill="FAFBFA" w:color="auto" w:val="clear"/>
+            <w:tcMar>
+              <w:top w:type="dxa" w:w="80"/>
+              <w:left w:type="dxa" w:w="110"/>
+              <w:bottom w:type="dxa" w:w="80"/>
+              <w:right w:type="dxa" w:w="110"/>
+            </w:tcMar>
+          </w:tcPr>
+          <w:p>
+            <w:pPr>
+              <w:spacing w:after="0"/>
+            </w:pPr>
+            <w:r>
+              <w:rPr>
+                <w:rFonts w:ascii="Calibri" w:cs="Calibri" w:eastAsia="Calibri" w:hAnsi="Calibri"/>
+                <w:sz w:val="20"/>
+                <w:szCs w:val="20"/>
+              </w:rPr>
+              <w:t xml:space="preserve"/>
+            </w:r>
+          </w:p>
+        </w:tc>
+        <w:tc>
+          <w:tcPr>
+            <w:tcW w:type="dxa" w:w="1200"/>
+            <w:tcBorders>
+              <w:top w:val="single" w:color="C9D3CD" w:sz="4"/>
+              <w:left w:val="single" w:color="C9D3CD" w:sz="4"/>
+              <w:bottom w:val="single" w:color="C9D3CD" w:sz="4"/>
+              <w:right w:val="single" w:color="C9D3CD" w:sz="4"/>
+            </w:tcBorders>
+            <w:shd w:fill="FAFBFA" w:color="auto" w:val="clear"/>
+            <w:tcMar>
+              <w:top w:type="dxa" w:w="80"/>
+              <w:left w:type="dxa" w:w="110"/>
+              <w:bottom w:type="dxa" w:w="80"/>
+              <w:right w:type="dxa" w:w="110"/>
+            </w:tcMar>
+          </w:tcPr>
+          <w:p>
+            <w:pPr>
+              <w:spacing w:after="0"/>
+            </w:pPr>
+            <w:r>
+              <w:rPr>
+                <w:rFonts w:ascii="Calibri" w:cs="Calibri" w:eastAsia="Calibri" w:hAnsi="Calibri"/>
+                <w:sz w:val="20"/>
+                <w:szCs w:val="20"/>
+              </w:rPr>
+              <w:t xml:space="preserve"/>
+            </w:r>
+          </w:p>
+        </w:tc>
+      </w:tr>
+      <w:tr>
+        <w:trPr>
+          <w:cantSplit/>
+        </w:trPr>
+        <w:tc>
+          <w:tcPr>
+            <w:tcW w:type="dxa" w:w="1900"/>
+            <w:tcBorders>
+              <w:top w:val="single" w:color="C9D3CD" w:sz="4"/>
+              <w:left w:val="single" w:color="C9D3CD" w:sz="4"/>
+              <w:bottom w:val="single" w:color="C9D3CD" w:sz="4"/>
+              <w:right w:val="single" w:color="C9D3CD" w:sz="4"/>
+            </w:tcBorders>
+            <w:shd w:fill="FFFFFF" w:color="auto" w:val="clear"/>
+            <w:tcMar>
+              <w:top w:type="dxa" w:w="80"/>
+              <w:left w:type="dxa" w:w="110"/>
+              <w:bottom w:type="dxa" w:w="80"/>
+              <w:right w:type="dxa" w:w="110"/>
+            </w:tcMar>
+          </w:tcPr>
+          <w:p>
+            <w:pPr>
+              <w:spacing w:after="0"/>
+            </w:pPr>
+            <w:r>
+              <w:rPr>
+                <w:rFonts w:ascii="Calibri" w:cs="Calibri" w:eastAsia="Calibri" w:hAnsi="Calibri"/>
+                <w:sz w:val="20"/>
+                <w:szCs w:val="20"/>
+              </w:rPr>
+              <w:t xml:space="preserve"/>
+            </w:r>
+          </w:p>
+        </w:tc>
+        <w:tc>
+          <w:tcPr>
+            <w:tcW w:type="dxa" w:w="2300"/>
+            <w:tcBorders>
+              <w:top w:val="single" w:color="C9D3CD" w:sz="4"/>
+              <w:left w:val="single" w:color="C9D3CD" w:sz="4"/>
+              <w:bottom w:val="single" w:color="C9D3CD" w:sz="4"/>
+              <w:right w:val="single" w:color="C9D3CD" w:sz="4"/>
+            </w:tcBorders>
+            <w:shd w:fill="FFFFFF" w:color="auto" w:val="clear"/>
+            <w:tcMar>
+              <w:top w:type="dxa" w:w="80"/>
+              <w:left w:type="dxa" w:w="110"/>
+              <w:bottom w:type="dxa" w:w="80"/>
+              <w:right w:type="dxa" w:w="110"/>
+            </w:tcMar>
+          </w:tcPr>
+          <w:p>
+            <w:pPr>
+              <w:spacing w:after="0"/>
+            </w:pPr>
+            <w:r>
+              <w:rPr>
+                <w:rFonts w:ascii="Calibri" w:cs="Calibri" w:eastAsia="Calibri" w:hAnsi="Calibri"/>
+                <w:sz w:val="20"/>
+                <w:szCs w:val="20"/>
+              </w:rPr>
+              <w:t xml:space="preserve"/>
+            </w:r>
+          </w:p>
+        </w:tc>
+        <w:tc>
+          <w:tcPr>
+            <w:tcW w:type="dxa" w:w="1500"/>
+            <w:tcBorders>
+              <w:top w:val="single" w:color="C9D3CD" w:sz="4"/>
+              <w:left w:val="single" w:color="C9D3CD" w:sz="4"/>
+              <w:bottom w:val="single" w:color="C9D3CD" w:sz="4"/>
+              <w:right w:val="single" w:color="C9D3CD" w:sz="4"/>
+            </w:tcBorders>
+            <w:shd w:fill="FFFFFF" w:color="auto" w:val="clear"/>
+            <w:tcMar>
+              <w:top w:type="dxa" w:w="80"/>
+              <w:left w:type="dxa" w:w="110"/>
+              <w:bottom w:type="dxa" w:w="80"/>
+              <w:right w:type="dxa" w:w="110"/>
+            </w:tcMar>
+          </w:tcPr>
+          <w:p>
+            <w:pPr>
+              <w:spacing w:after="0"/>
+            </w:pPr>
+            <w:r>
+              <w:rPr>
+                <w:rFonts w:ascii="Calibri" w:cs="Calibri" w:eastAsia="Calibri" w:hAnsi="Calibri"/>
+                <w:sz w:val="20"/>
+                <w:szCs w:val="20"/>
+              </w:rPr>
+              <w:t xml:space="preserve"/>
+            </w:r>
+          </w:p>
+        </w:tc>
+        <w:tc>
+          <w:tcPr>
+            <w:tcW w:type="dxa" w:w="1300"/>
+            <w:tcBorders>
+              <w:top w:val="single" w:color="C9D3CD" w:sz="4"/>
+              <w:left w:val="single" w:color="C9D3CD" w:sz="4"/>
+              <w:bottom w:val="single" w:color="C9D3CD" w:sz="4"/>
+              <w:right w:val="single" w:color="C9D3CD" w:sz="4"/>
+            </w:tcBorders>
+            <w:shd w:fill="FFFFFF" w:color="auto" w:val="clear"/>
+            <w:tcMar>
+              <w:top w:type="dxa" w:w="80"/>
+              <w:left w:type="dxa" w:w="110"/>
+              <w:bottom w:type="dxa" w:w="80"/>
+              <w:right w:type="dxa" w:w="110"/>
+            </w:tcMar>
+          </w:tcPr>
+          <w:p>
+            <w:pPr>
+              <w:spacing w:after="0"/>
+            </w:pPr>
+            <w:r>
+              <w:rPr>
+                <w:rFonts w:ascii="Calibri" w:cs="Calibri" w:eastAsia="Calibri" w:hAnsi="Calibri"/>
+                <w:sz w:val="20"/>
+                <w:szCs w:val="20"/>
+              </w:rPr>
+              <w:t xml:space="preserve"/>
+            </w:r>
+          </w:p>
+        </w:tc>
+        <w:tc>
+          <w:tcPr>
+            <w:tcW w:type="dxa" w:w="1438"/>
+            <w:tcBorders>
+              <w:top w:val="single" w:color="C9D3CD" w:sz="4"/>
+              <w:left w:val="single" w:color="C9D3CD" w:sz="4"/>
+              <w:bottom w:val="single" w:color="C9D3CD" w:sz="4"/>
+              <w:right w:val="single" w:color="C9D3CD" w:sz="4"/>
+            </w:tcBorders>
+            <w:shd w:fill="FFFFFF" w:color="auto" w:val="clear"/>
+            <w:tcMar>
+              <w:top w:type="dxa" w:w="80"/>
+              <w:left w:type="dxa" w:w="110"/>
+              <w:bottom w:type="dxa" w:w="80"/>
+              <w:right w:type="dxa" w:w="110"/>
+            </w:tcMar>
+          </w:tcPr>
+          <w:p>
+            <w:pPr>
+              <w:spacing w:after="0"/>
+            </w:pPr>
+            <w:r>
+              <w:rPr>
+                <w:rFonts w:ascii="Calibri" w:cs="Calibri" w:eastAsia="Calibri" w:hAnsi="Calibri"/>
+                <w:sz w:val="20"/>
+                <w:szCs w:val="20"/>
+              </w:rPr>
+              <w:t xml:space="preserve"/>
+            </w:r>
+          </w:p>
+        </w:tc>
+        <w:tc>
+          <w:tcPr>
+            <w:tcW w:type="dxa" w:w="1200"/>
+            <w:tcBorders>
+              <w:top w:val="single" w:color="C9D3CD" w:sz="4"/>
+              <w:left w:val="single" w:color="C9D3CD" w:sz="4"/>
+              <w:bottom w:val="single" w:color="C9D3CD" w:sz="4"/>
+              <w:right w:val="single" w:color="C9D3CD" w:sz="4"/>
+            </w:tcBorders>
+            <w:shd w:fill="FFFFFF" w:color="auto" w:val="clear"/>
+            <w:tcMar>
+              <w:top w:type="dxa" w:w="80"/>
+              <w:left w:type="dxa" w:w="110"/>
+              <w:bottom w:type="dxa" w:w="80"/>
+              <w:right w:type="dxa" w:w="110"/>
+            </w:tcMar>
+          </w:tcPr>
+          <w:p>
+            <w:pPr>
+              <w:spacing w:after="0"/>
+            </w:pPr>
+            <w:r>
+              <w:rPr>
+                <w:rFonts w:ascii="Calibri" w:cs="Calibri" w:eastAsia="Calibri" w:hAnsi="Calibri"/>
+                <w:sz w:val="20"/>
+                <w:szCs w:val="20"/>
+              </w:rPr>
+              <w:t xml:space="preserve"/>
+            </w:r>
+          </w:p>
+        </w:tc>
+      </w:tr>
+      <w:tr>
+        <w:trPr>
+          <w:cantSplit/>
+        </w:trPr>
+        <w:tc>
+          <w:tcPr>
+            <w:tcW w:type="dxa" w:w="1900"/>
+            <w:tcBorders>
+              <w:top w:val="single" w:color="C9D3CD" w:sz="4"/>
+              <w:left w:val="single" w:color="C9D3CD" w:sz="4"/>
+              <w:bottom w:val="single" w:color="C9D3CD" w:sz="4"/>
+              <w:right w:val="single" w:color="C9D3CD" w:sz="4"/>
+            </w:tcBorders>
+            <w:shd w:fill="FAFBFA" w:color="auto" w:val="clear"/>
+            <w:tcMar>
+              <w:top w:type="dxa" w:w="80"/>
+              <w:left w:type="dxa" w:w="110"/>
+              <w:bottom w:type="dxa" w:w="80"/>
+              <w:right w:type="dxa" w:w="110"/>
+            </w:tcMar>
+          </w:tcPr>
+          <w:p>
+            <w:pPr>
+              <w:spacing w:after="0"/>
+            </w:pPr>
+            <w:r>
+              <w:rPr>
+                <w:rFonts w:ascii="Calibri" w:cs="Calibri" w:eastAsia="Calibri" w:hAnsi="Calibri"/>
+                <w:sz w:val="20"/>
+                <w:szCs w:val="20"/>
+              </w:rPr>
+              <w:t xml:space="preserve"/>
+            </w:r>
+          </w:p>
+        </w:tc>
+        <w:tc>
+          <w:tcPr>
+            <w:tcW w:type="dxa" w:w="2300"/>
+            <w:tcBorders>
+              <w:top w:val="single" w:color="C9D3CD" w:sz="4"/>
+              <w:left w:val="single" w:color="C9D3CD" w:sz="4"/>
+              <w:bottom w:val="single" w:color="C9D3CD" w:sz="4"/>
+              <w:right w:val="single" w:color="C9D3CD" w:sz="4"/>
+            </w:tcBorders>
+            <w:shd w:fill="FAFBFA" w:color="auto" w:val="clear"/>
+            <w:tcMar>
+              <w:top w:type="dxa" w:w="80"/>
+              <w:left w:type="dxa" w:w="110"/>
+              <w:bottom w:type="dxa" w:w="80"/>
+              <w:right w:type="dxa" w:w="110"/>
+            </w:tcMar>
+          </w:tcPr>
+          <w:p>
+            <w:pPr>
+              <w:spacing w:after="0"/>
+            </w:pPr>
+            <w:r>
+              <w:rPr>
+                <w:rFonts w:ascii="Calibri" w:cs="Calibri" w:eastAsia="Calibri" w:hAnsi="Calibri"/>
+                <w:sz w:val="20"/>
+                <w:szCs w:val="20"/>
+              </w:rPr>
+              <w:t xml:space="preserve"/>
+            </w:r>
+          </w:p>
+        </w:tc>
+        <w:tc>
+          <w:tcPr>
+            <w:tcW w:type="dxa" w:w="1500"/>
+            <w:tcBorders>
+              <w:top w:val="single" w:color="C9D3CD" w:sz="4"/>
+              <w:left w:val="single" w:color="C9D3CD" w:sz="4"/>
+              <w:bottom w:val="single" w:color="C9D3CD" w:sz="4"/>
+              <w:right w:val="single" w:color="C9D3CD" w:sz="4"/>
+            </w:tcBorders>
+            <w:shd w:fill="FAFBFA" w:color="auto" w:val="clear"/>
+            <w:tcMar>
+              <w:top w:type="dxa" w:w="80"/>
+              <w:left w:type="dxa" w:w="110"/>
+              <w:bottom w:type="dxa" w:w="80"/>
+              <w:right w:type="dxa" w:w="110"/>
+            </w:tcMar>
+          </w:tcPr>
+          <w:p>
+            <w:pPr>
+              <w:spacing w:after="0"/>
+            </w:pPr>
+            <w:r>
+              <w:rPr>
+                <w:rFonts w:ascii="Calibri" w:cs="Calibri" w:eastAsia="Calibri" w:hAnsi="Calibri"/>
+                <w:sz w:val="20"/>
+                <w:szCs w:val="20"/>
+              </w:rPr>
+              <w:t xml:space="preserve"/>
+            </w:r>
+          </w:p>
+        </w:tc>
+        <w:tc>
+          <w:tcPr>
+            <w:tcW w:type="dxa" w:w="1300"/>
+            <w:tcBorders>
+              <w:top w:val="single" w:color="C9D3CD" w:sz="4"/>
+              <w:left w:val="single" w:color="C9D3CD" w:sz="4"/>
+              <w:bottom w:val="single" w:color="C9D3CD" w:sz="4"/>
+              <w:right w:val="single" w:color="C9D3CD" w:sz="4"/>
+            </w:tcBorders>
+            <w:shd w:fill="FAFBFA" w:color="auto" w:val="clear"/>
+            <w:tcMar>
+              <w:top w:type="dxa" w:w="80"/>
+              <w:left w:type="dxa" w:w="110"/>
+              <w:bottom w:type="dxa" w:w="80"/>
+              <w:right w:type="dxa" w:w="110"/>
+            </w:tcMar>
+          </w:tcPr>
+          <w:p>
+            <w:pPr>
+              <w:spacing w:after="0"/>
+            </w:pPr>
+            <w:r>
+              <w:rPr>
+                <w:rFonts w:ascii="Calibri" w:cs="Calibri" w:eastAsia="Calibri" w:hAnsi="Calibri"/>
+                <w:sz w:val="20"/>
+                <w:szCs w:val="20"/>
+              </w:rPr>
+              <w:t xml:space="preserve"/>
+            </w:r>
+          </w:p>
+        </w:tc>
+        <w:tc>
+          <w:tcPr>
+            <w:tcW w:type="dxa" w:w="1438"/>
+            <w:tcBorders>
+              <w:top w:val="single" w:color="C9D3CD" w:sz="4"/>
+              <w:left w:val="single" w:color="C9D3CD" w:sz="4"/>
+              <w:bottom w:val="single" w:color="C9D3CD" w:sz="4"/>
+              <w:right w:val="single" w:color="C9D3CD" w:sz="4"/>
+            </w:tcBorders>
+            <w:shd w:fill="FAFBFA" w:color="auto" w:val="clear"/>
+            <w:tcMar>
+              <w:top w:type="dxa" w:w="80"/>
+              <w:left w:type="dxa" w:w="110"/>
+              <w:bottom w:type="dxa" w:w="80"/>
+              <w:right w:type="dxa" w:w="110"/>
+            </w:tcMar>
+          </w:tcPr>
+          <w:p>
+            <w:pPr>
+              <w:spacing w:after="0"/>
+            </w:pPr>
+            <w:r>
+              <w:rPr>
+                <w:rFonts w:ascii="Calibri" w:cs="Calibri" w:eastAsia="Calibri" w:hAnsi="Calibri"/>
+                <w:sz w:val="20"/>
+                <w:szCs w:val="20"/>
+              </w:rPr>
+              <w:t xml:space="preserve"/>
+            </w:r>
+          </w:p>
+        </w:tc>
+        <w:tc>
+          <w:tcPr>
+            <w:tcW w:type="dxa" w:w="1200"/>
+            <w:tcBorders>
+              <w:top w:val="single" w:color="C9D3CD" w:sz="4"/>
+              <w:left w:val="single" w:color="C9D3CD" w:sz="4"/>
+              <w:bottom w:val="single" w:color="C9D3CD" w:sz="4"/>
+              <w:right w:val="single" w:color="C9D3CD" w:sz="4"/>
+            </w:tcBorders>
+            <w:shd w:fill="FAFBFA" w:color="auto" w:val="clear"/>
+            <w:tcMar>
+              <w:top w:type="dxa" w:w="80"/>
+              <w:left w:type="dxa" w:w="110"/>
+              <w:bottom w:type="dxa" w:w="80"/>
+              <w:right w:type="dxa" w:w="110"/>
+            </w:tcMar>
+          </w:tcPr>
+          <w:p>
+            <w:pPr>
+              <w:spacing w:after="0"/>
+            </w:pPr>
+            <w:r>
+              <w:rPr>
+                <w:rFonts w:ascii="Calibri" w:cs="Calibri" w:eastAsia="Calibri" w:hAnsi="Calibri"/>
+                <w:sz w:val="20"/>
+                <w:szCs w:val="20"/>
+              </w:rPr>
+              <w:t xml:space="preserve"/>
+            </w:r>
+          </w:p>
+        </w:tc>
+      </w:tr>
+      <w:tr>
+        <w:trPr>
+          <w:cantSplit/>
+        </w:trPr>
+        <w:tc>
+          <w:tcPr>
+            <w:tcW w:type="dxa" w:w="1900"/>
+            <w:tcBorders>
+              <w:top w:val="single" w:color="C9D3CD" w:sz="4"/>
+              <w:left w:val="single" w:color="C9D3CD" w:sz="4"/>
+              <w:bottom w:val="single" w:color="C9D3CD" w:sz="4"/>
+              <w:right w:val="single" w:color="C9D3CD" w:sz="4"/>
+            </w:tcBorders>
+            <w:shd w:fill="FFFFFF" w:color="auto" w:val="clear"/>
+            <w:tcMar>
+              <w:top w:type="dxa" w:w="80"/>
+              <w:left w:type="dxa" w:w="110"/>
+              <w:bottom w:type="dxa" w:w="80"/>
+              <w:right w:type="dxa" w:w="110"/>
+            </w:tcMar>
+          </w:tcPr>
+          <w:p>
+            <w:pPr>
+              <w:spacing w:after="0"/>
+            </w:pPr>
+            <w:r>
+              <w:rPr>
+                <w:rFonts w:ascii="Calibri" w:cs="Calibri" w:eastAsia="Calibri" w:hAnsi="Calibri"/>
+                <w:sz w:val="20"/>
+                <w:szCs w:val="20"/>
+              </w:rPr>
+              <w:t xml:space="preserve"/>
+            </w:r>
+          </w:p>
+        </w:tc>
+        <w:tc>
+          <w:tcPr>
+            <w:tcW w:type="dxa" w:w="2300"/>
+            <w:tcBorders>
+              <w:top w:val="single" w:color="C9D3CD" w:sz="4"/>
+              <w:left w:val="single" w:color="C9D3CD" w:sz="4"/>
+              <w:bottom w:val="single" w:color="C9D3CD" w:sz="4"/>
+              <w:right w:val="single" w:color="C9D3CD" w:sz="4"/>
+            </w:tcBorders>
+            <w:shd w:fill="FFFFFF" w:color="auto" w:val="clear"/>
+            <w:tcMar>
+              <w:top w:type="dxa" w:w="80"/>
+              <w:left w:type="dxa" w:w="110"/>
+              <w:bottom w:type="dxa" w:w="80"/>
+              <w:right w:type="dxa" w:w="110"/>
+            </w:tcMar>
+          </w:tcPr>
+          <w:p>
+            <w:pPr>
+              <w:spacing w:after="0"/>
+            </w:pPr>
+            <w:r>
+              <w:rPr>
+                <w:rFonts w:ascii="Calibri" w:cs="Calibri" w:eastAsia="Calibri" w:hAnsi="Calibri"/>
+                <w:sz w:val="20"/>
+                <w:szCs w:val="20"/>
+              </w:rPr>
+              <w:t xml:space="preserve"/>
+            </w:r>
+          </w:p>
+        </w:tc>
+        <w:tc>
+          <w:tcPr>
+            <w:tcW w:type="dxa" w:w="1500"/>
+            <w:tcBorders>
+              <w:top w:val="single" w:color="C9D3CD" w:sz="4"/>
+              <w:left w:val="single" w:color="C9D3CD" w:sz="4"/>
+              <w:bottom w:val="single" w:color="C9D3CD" w:sz="4"/>
+              <w:right w:val="single" w:color="C9D3CD" w:sz="4"/>
+            </w:tcBorders>
+            <w:shd w:fill="FFFFFF" w:color="auto" w:val="clear"/>
+            <w:tcMar>
+              <w:top w:type="dxa" w:w="80"/>
+              <w:left w:type="dxa" w:w="110"/>
+              <w:bottom w:type="dxa" w:w="80"/>
+              <w:right w:type="dxa" w:w="110"/>
+            </w:tcMar>
+          </w:tcPr>
+          <w:p>
+            <w:pPr>
+              <w:spacing w:after="0"/>
+            </w:pPr>
+            <w:r>
+              <w:rPr>
+                <w:rFonts w:ascii="Calibri" w:cs="Calibri" w:eastAsia="Calibri" w:hAnsi="Calibri"/>
+                <w:sz w:val="20"/>
+                <w:szCs w:val="20"/>
+              </w:rPr>
+              <w:t xml:space="preserve"/>
+            </w:r>
+          </w:p>
+        </w:tc>
+        <w:tc>
+          <w:tcPr>
+            <w:tcW w:type="dxa" w:w="1300"/>
+            <w:tcBorders>
+              <w:top w:val="single" w:color="C9D3CD" w:sz="4"/>
+              <w:left w:val="single" w:color="C9D3CD" w:sz="4"/>
+              <w:bottom w:val="single" w:color="C9D3CD" w:sz="4"/>
+              <w:right w:val="single" w:color="C9D3CD" w:sz="4"/>
+            </w:tcBorders>
+            <w:shd w:fill="FFFFFF" w:color="auto" w:val="clear"/>
+            <w:tcMar>
+              <w:top w:type="dxa" w:w="80"/>
+              <w:left w:type="dxa" w:w="110"/>
+              <w:bottom w:type="dxa" w:w="80"/>
+              <w:right w:type="dxa" w:w="110"/>
+            </w:tcMar>
+          </w:tcPr>
+          <w:p>
+            <w:pPr>
+              <w:spacing w:after="0"/>
+            </w:pPr>
+            <w:r>
+              <w:rPr>
+                <w:rFonts w:ascii="Calibri" w:cs="Calibri" w:eastAsia="Calibri" w:hAnsi="Calibri"/>
+                <w:sz w:val="20"/>
+                <w:szCs w:val="20"/>
+              </w:rPr>
+              <w:t xml:space="preserve"/>
+            </w:r>
+          </w:p>
+        </w:tc>
+        <w:tc>
+          <w:tcPr>
+            <w:tcW w:type="dxa" w:w="1438"/>
+            <w:tcBorders>
+              <w:top w:val="single" w:color="C9D3CD" w:sz="4"/>
+              <w:left w:val="single" w:color="C9D3CD" w:sz="4"/>
+              <w:bottom w:val="single" w:color="C9D3CD" w:sz="4"/>
+              <w:right w:val="single" w:color="C9D3CD" w:sz="4"/>
+            </w:tcBorders>
+            <w:shd w:fill="FFFFFF" w:color="auto" w:val="clear"/>
+            <w:tcMar>
+              <w:top w:type="dxa" w:w="80"/>
+              <w:left w:type="dxa" w:w="110"/>
+              <w:bottom w:type="dxa" w:w="80"/>
+              <w:right w:type="dxa" w:w="110"/>
+            </w:tcMar>
+          </w:tcPr>
+          <w:p>
+            <w:pPr>
+              <w:spacing w:after="0"/>
+            </w:pPr>
+            <w:r>
+              <w:rPr>
+                <w:rFonts w:ascii="Calibri" w:cs="Calibri" w:eastAsia="Calibri" w:hAnsi="Calibri"/>
+                <w:sz w:val="20"/>
+                <w:szCs w:val="20"/>
+              </w:rPr>
+              <w:t xml:space="preserve"/>
+            </w:r>
+          </w:p>
+        </w:tc>
+        <w:tc>
+          <w:tcPr>
+            <w:tcW w:type="dxa" w:w="1200"/>
+            <w:tcBorders>
+              <w:top w:val="single" w:color="C9D3CD" w:sz="4"/>
+              <w:left w:val="single" w:color="C9D3CD" w:sz="4"/>
+              <w:bottom w:val="single" w:color="C9D3CD" w:sz="4"/>
+              <w:right w:val="single" w:color="C9D3CD" w:sz="4"/>
+            </w:tcBorders>
+            <w:shd w:fill="FFFFFF" w:color="auto" w:val="clear"/>
+            <w:tcMar>
+              <w:top w:type="dxa" w:w="80"/>
+              <w:left w:type="dxa" w:w="110"/>
+              <w:bottom w:type="dxa" w:w="80"/>
+              <w:right w:type="dxa" w:w="110"/>
+            </w:tcMar>
+          </w:tcPr>
+          <w:p>
+            <w:pPr>
+              <w:spacing w:after="0"/>
+            </w:pPr>
+            <w:r>
+              <w:rPr>
+                <w:rFonts w:ascii="Calibri" w:cs="Calibri" w:eastAsia="Calibri" w:hAnsi="Calibri"/>
+                <w:sz w:val="20"/>
+                <w:szCs w:val="20"/>
+              </w:rPr>
+              <w:t xml:space="preserve"/>
+            </w:r>
+          </w:p>
+        </w:tc>
+      </w:tr>
+      <w:tr>
+        <w:trPr>
+          <w:cantSplit/>
+        </w:trPr>
+        <w:tc>
+          <w:tcPr>
+            <w:tcW w:type="dxa" w:w="1900"/>
+            <w:tcBorders>
+              <w:top w:val="single" w:color="C9D3CD" w:sz="4"/>
+              <w:left w:val="single" w:color="C9D3CD" w:sz="4"/>
+              <w:bottom w:val="single" w:color="C9D3CD" w:sz="4"/>
+              <w:right w:val="single" w:color="C9D3CD" w:sz="4"/>
+            </w:tcBorders>
+            <w:shd w:fill="FAFBFA" w:color="auto" w:val="clear"/>
+            <w:tcMar>
+              <w:top w:type="dxa" w:w="80"/>
+              <w:left w:type="dxa" w:w="110"/>
+              <w:bottom w:type="dxa" w:w="80"/>
+              <w:right w:type="dxa" w:w="110"/>
+            </w:tcMar>
+          </w:tcPr>
+          <w:p>
+            <w:pPr>
+              <w:spacing w:after="0"/>
+            </w:pPr>
+            <w:r>
+              <w:rPr>
+                <w:rFonts w:ascii="Calibri" w:cs="Calibri" w:eastAsia="Calibri" w:hAnsi="Calibri"/>
+                <w:sz w:val="20"/>
+                <w:szCs w:val="20"/>
+              </w:rPr>
+              <w:t xml:space="preserve"/>
+            </w:r>
+          </w:p>
+        </w:tc>
+        <w:tc>
+          <w:tcPr>
+            <w:tcW w:type="dxa" w:w="2300"/>
+            <w:tcBorders>
+              <w:top w:val="single" w:color="C9D3CD" w:sz="4"/>
+              <w:left w:val="single" w:color="C9D3CD" w:sz="4"/>
+              <w:bottom w:val="single" w:color="C9D3CD" w:sz="4"/>
+              <w:right w:val="single" w:color="C9D3CD" w:sz="4"/>
+            </w:tcBorders>
+            <w:shd w:fill="FAFBFA" w:color="auto" w:val="clear"/>
+            <w:tcMar>
+              <w:top w:type="dxa" w:w="80"/>
+              <w:left w:type="dxa" w:w="110"/>
+              <w:bottom w:type="dxa" w:w="80"/>
+              <w:right w:type="dxa" w:w="110"/>
+            </w:tcMar>
+          </w:tcPr>
+          <w:p>
+            <w:pPr>
+              <w:spacing w:after="0"/>
+            </w:pPr>
+            <w:r>
+              <w:rPr>
+                <w:rFonts w:ascii="Calibri" w:cs="Calibri" w:eastAsia="Calibri" w:hAnsi="Calibri"/>
+                <w:sz w:val="20"/>
+                <w:szCs w:val="20"/>
+              </w:rPr>
+              <w:t xml:space="preserve"/>
+            </w:r>
+          </w:p>
+        </w:tc>
+        <w:tc>
+          <w:tcPr>
+            <w:tcW w:type="dxa" w:w="1500"/>
+            <w:tcBorders>
+              <w:top w:val="single" w:color="C9D3CD" w:sz="4"/>
+              <w:left w:val="single" w:color="C9D3CD" w:sz="4"/>
+              <w:bottom w:val="single" w:color="C9D3CD" w:sz="4"/>
+              <w:right w:val="single" w:color="C9D3CD" w:sz="4"/>
+            </w:tcBorders>
+            <w:shd w:fill="FAFBFA" w:color="auto" w:val="clear"/>
+            <w:tcMar>
+              <w:top w:type="dxa" w:w="80"/>
+              <w:left w:type="dxa" w:w="110"/>
+              <w:bottom w:type="dxa" w:w="80"/>
+              <w:right w:type="dxa" w:w="110"/>
+            </w:tcMar>
+          </w:tcPr>
+          <w:p>
+            <w:pPr>
+              <w:spacing w:after="0"/>
+            </w:pPr>
+            <w:r>
+              <w:rPr>
+                <w:rFonts w:ascii="Calibri" w:cs="Calibri" w:eastAsia="Calibri" w:hAnsi="Calibri"/>
+                <w:sz w:val="20"/>
+                <w:szCs w:val="20"/>
+              </w:rPr>
+              <w:t xml:space="preserve"/>
+            </w:r>
+          </w:p>
+        </w:tc>
+        <w:tc>
+          <w:tcPr>
+            <w:tcW w:type="dxa" w:w="1300"/>
+            <w:tcBorders>
+              <w:top w:val="single" w:color="C9D3CD" w:sz="4"/>
+              <w:left w:val="single" w:color="C9D3CD" w:sz="4"/>
+              <w:bottom w:val="single" w:color="C9D3CD" w:sz="4"/>
+              <w:right w:val="single" w:color="C9D3CD" w:sz="4"/>
+            </w:tcBorders>
+            <w:shd w:fill="FAFBFA" w:color="auto" w:val="clear"/>
+            <w:tcMar>
+              <w:top w:type="dxa" w:w="80"/>
+              <w:left w:type="dxa" w:w="110"/>
+              <w:bottom w:type="dxa" w:w="80"/>
+              <w:right w:type="dxa" w:w="110"/>
+            </w:tcMar>
+          </w:tcPr>
+          <w:p>
+            <w:pPr>
+              <w:spacing w:after="0"/>
+            </w:pPr>
+            <w:r>
+              <w:rPr>
+                <w:rFonts w:ascii="Calibri" w:cs="Calibri" w:eastAsia="Calibri" w:hAnsi="Calibri"/>
+                <w:sz w:val="20"/>
+                <w:szCs w:val="20"/>
+              </w:rPr>
+              <w:t xml:space="preserve"/>
+            </w:r>
+          </w:p>
+        </w:tc>
+        <w:tc>
+          <w:tcPr>
+            <w:tcW w:type="dxa" w:w="1438"/>
+            <w:tcBorders>
+              <w:top w:val="single" w:color="C9D3CD" w:sz="4"/>
+              <w:left w:val="single" w:color="C9D3CD" w:sz="4"/>
+              <w:bottom w:val="single" w:color="C9D3CD" w:sz="4"/>
+              <w:right w:val="single" w:color="C9D3CD" w:sz="4"/>
+            </w:tcBorders>
+            <w:shd w:fill="FAFBFA" w:color="auto" w:val="clear"/>
+            <w:tcMar>
+              <w:top w:type="dxa" w:w="80"/>
+              <w:left w:type="dxa" w:w="110"/>
+              <w:bottom w:type="dxa" w:w="80"/>
+              <w:right w:type="dxa" w:w="110"/>
+            </w:tcMar>
+          </w:tcPr>
+          <w:p>
+            <w:pPr>
+              <w:spacing w:after="0"/>
+            </w:pPr>
+            <w:r>
+              <w:rPr>
+                <w:rFonts w:ascii="Calibri" w:cs="Calibri" w:eastAsia="Calibri" w:hAnsi="Calibri"/>
+                <w:sz w:val="20"/>
+                <w:szCs w:val="20"/>
+              </w:rPr>
+              <w:t xml:space="preserve"/>
+            </w:r>
+          </w:p>
+        </w:tc>
+        <w:tc>
+          <w:tcPr>
+            <w:tcW w:type="dxa" w:w="1200"/>
+            <w:tcBorders>
+              <w:top w:val="single" w:color="C9D3CD" w:sz="4"/>
+              <w:left w:val="single" w:color="C9D3CD" w:sz="4"/>
+              <w:bottom w:val="single" w:color="C9D3CD" w:sz="4"/>
+              <w:right w:val="single" w:color="C9D3CD" w:sz="4"/>
+            </w:tcBorders>
+            <w:shd w:fill="FAFBFA" w:color="auto" w:val="clear"/>
+            <w:tcMar>
+              <w:top w:type="dxa" w:w="80"/>
+              <w:left w:type="dxa" w:w="110"/>
+              <w:bottom w:type="dxa" w:w="80"/>
+              <w:right w:type="dxa" w:w="110"/>
+            </w:tcMar>
+          </w:tcPr>
+          <w:p>
+            <w:pPr>
+              <w:spacing w:after="0"/>
+            </w:pPr>
+            <w:r>
+              <w:rPr>
+                <w:rFonts w:ascii="Calibri" w:cs="Calibri" w:eastAsia="Calibri" w:hAnsi="Calibri"/>
+                <w:sz w:val="20"/>
+                <w:szCs w:val="20"/>
+              </w:rPr>
+              <w:t xml:space="preserve"/>
+            </w:r>
+          </w:p>
+        </w:tc>
+      </w:tr>
+      <w:tr>
+        <w:trPr>
+          <w:cantSplit/>
+        </w:trPr>
+        <w:tc>
+          <w:tcPr>
+            <w:tcW w:type="dxa" w:w="1900"/>
+            <w:tcBorders>
+              <w:top w:val="single" w:color="C9D3CD" w:sz="4"/>
+              <w:left w:val="single" w:color="C9D3CD" w:sz="4"/>
+              <w:bottom w:val="single" w:color="C9D3CD" w:sz="4"/>
+              <w:right w:val="single" w:color="C9D3CD" w:sz="4"/>
+            </w:tcBorders>
+            <w:shd w:fill="FFFFFF" w:color="auto" w:val="clear"/>
+            <w:tcMar>
+              <w:top w:type="dxa" w:w="80"/>
+              <w:left w:type="dxa" w:w="110"/>
+              <w:bottom w:type="dxa" w:w="80"/>
+              <w:right w:type="dxa" w:w="110"/>
+            </w:tcMar>
+          </w:tcPr>
+          <w:p>
+            <w:pPr>
+              <w:spacing w:after="0"/>
+            </w:pPr>
+            <w:r>
+              <w:rPr>
+                <w:rFonts w:ascii="Calibri" w:cs="Calibri" w:eastAsia="Calibri" w:hAnsi="Calibri"/>
+                <w:sz w:val="20"/>
+                <w:szCs w:val="20"/>
+              </w:rPr>
+              <w:t xml:space="preserve"/>
+            </w:r>
+          </w:p>
+        </w:tc>
+        <w:tc>
+          <w:tcPr>
+            <w:tcW w:type="dxa" w:w="2300"/>
+            <w:tcBorders>
+              <w:top w:val="single" w:color="C9D3CD" w:sz="4"/>
+              <w:left w:val="single" w:color="C9D3CD" w:sz="4"/>
+              <w:bottom w:val="single" w:color="C9D3CD" w:sz="4"/>
+              <w:right w:val="single" w:color="C9D3CD" w:sz="4"/>
+            </w:tcBorders>
+            <w:shd w:fill="FFFFFF" w:color="auto" w:val="clear"/>
+            <w:tcMar>
+              <w:top w:type="dxa" w:w="80"/>
+              <w:left w:type="dxa" w:w="110"/>
+              <w:bottom w:type="dxa" w:w="80"/>
+              <w:right w:type="dxa" w:w="110"/>
+            </w:tcMar>
+          </w:tcPr>
+          <w:p>
+            <w:pPr>
+              <w:spacing w:after="0"/>
+            </w:pPr>
+            <w:r>
+              <w:rPr>
+                <w:rFonts w:ascii="Calibri" w:cs="Calibri" w:eastAsia="Calibri" w:hAnsi="Calibri"/>
+                <w:sz w:val="20"/>
+                <w:szCs w:val="20"/>
+              </w:rPr>
+              <w:t xml:space="preserve"/>
+            </w:r>
+          </w:p>
+        </w:tc>
+        <w:tc>
+          <w:tcPr>
+            <w:tcW w:type="dxa" w:w="1500"/>
+            <w:tcBorders>
+              <w:top w:val="single" w:color="C9D3CD" w:sz="4"/>
+              <w:left w:val="single" w:color="C9D3CD" w:sz="4"/>
+              <w:bottom w:val="single" w:color="C9D3CD" w:sz="4"/>
+              <w:right w:val="single" w:color="C9D3CD" w:sz="4"/>
+            </w:tcBorders>
+            <w:shd w:fill="FFFFFF" w:color="auto" w:val="clear"/>
+            <w:tcMar>
+              <w:top w:type="dxa" w:w="80"/>
+              <w:left w:type="dxa" w:w="110"/>
+              <w:bottom w:type="dxa" w:w="80"/>
+              <w:right w:type="dxa" w:w="110"/>
+            </w:tcMar>
+          </w:tcPr>
+          <w:p>
+            <w:pPr>
+              <w:spacing w:after="0"/>
+            </w:pPr>
+            <w:r>
+              <w:rPr>
+                <w:rFonts w:ascii="Calibri" w:cs="Calibri" w:eastAsia="Calibri" w:hAnsi="Calibri"/>
+                <w:sz w:val="20"/>
+                <w:szCs w:val="20"/>
+              </w:rPr>
+              <w:t xml:space="preserve"/>
+            </w:r>
+          </w:p>
+        </w:tc>
+        <w:tc>
+          <w:tcPr>
+            <w:tcW w:type="dxa" w:w="1300"/>
+            <w:tcBorders>
+              <w:top w:val="single" w:color="C9D3CD" w:sz="4"/>
+              <w:left w:val="single" w:color="C9D3CD" w:sz="4"/>
+              <w:bottom w:val="single" w:color="C9D3CD" w:sz="4"/>
+              <w:right w:val="single" w:color="C9D3CD" w:sz="4"/>
+            </w:tcBorders>
+            <w:shd w:fill="FFFFFF" w:color="auto" w:val="clear"/>
+            <w:tcMar>
+              <w:top w:type="dxa" w:w="80"/>
+              <w:left w:type="dxa" w:w="110"/>
+              <w:bottom w:type="dxa" w:w="80"/>
+              <w:right w:type="dxa" w:w="110"/>
+            </w:tcMar>
+          </w:tcPr>
+          <w:p>
+            <w:pPr>
+              <w:spacing w:after="0"/>
+            </w:pPr>
+            <w:r>
+              <w:rPr>
+                <w:rFonts w:ascii="Calibri" w:cs="Calibri" w:eastAsia="Calibri" w:hAnsi="Calibri"/>
+                <w:sz w:val="20"/>
+                <w:szCs w:val="20"/>
+              </w:rPr>
+              <w:t xml:space="preserve"/>
+            </w:r>
+          </w:p>
+        </w:tc>
+        <w:tc>
+          <w:tcPr>
+            <w:tcW w:type="dxa" w:w="1438"/>
+            <w:tcBorders>
+              <w:top w:val="single" w:color="C9D3CD" w:sz="4"/>
+              <w:left w:val="single" w:color="C9D3CD" w:sz="4"/>
+              <w:bottom w:val="single" w:color="C9D3CD" w:sz="4"/>
+              <w:right w:val="single" w:color="C9D3CD" w:sz="4"/>
+            </w:tcBorders>
+            <w:shd w:fill="FFFFFF" w:color="auto" w:val="clear"/>
+            <w:tcMar>
+              <w:top w:type="dxa" w:w="80"/>
+              <w:left w:type="dxa" w:w="110"/>
+              <w:bottom w:type="dxa" w:w="80"/>
+              <w:right w:type="dxa" w:w="110"/>
+            </w:tcMar>
+          </w:tcPr>
+          <w:p>
+            <w:pPr>
+              <w:spacing w:after="0"/>
+            </w:pPr>
+            <w:r>
+              <w:rPr>
+                <w:rFonts w:ascii="Calibri" w:cs="Calibri" w:eastAsia="Calibri" w:hAnsi="Calibri"/>
+                <w:sz w:val="20"/>
+                <w:szCs w:val="20"/>
+              </w:rPr>
+              <w:t xml:space="preserve"/>
+            </w:r>
+          </w:p>
+        </w:tc>
+        <w:tc>
+          <w:tcPr>
+            <w:tcW w:type="dxa" w:w="1200"/>
+            <w:tcBorders>
+              <w:top w:val="single" w:color="C9D3CD" w:sz="4"/>
+              <w:left w:val="single" w:color="C9D3CD" w:sz="4"/>
+              <w:bottom w:val="single" w:color="C9D3CD" w:sz="4"/>
+              <w:right w:val="single" w:color="C9D3CD" w:sz="4"/>
+            </w:tcBorders>
+            <w:shd w:fill="FFFFFF" w:color="auto" w:val="clear"/>
+            <w:tcMar>
+              <w:top w:type="dxa" w:w="80"/>
+              <w:left w:type="dxa" w:w="110"/>
+              <w:bottom w:type="dxa" w:w="80"/>
+              <w:right w:type="dxa" w:w="110"/>
+            </w:tcMar>
+          </w:tcPr>
+          <w:p>
+            <w:pPr>
+              <w:spacing w:after="0"/>
+            </w:pPr>
+            <w:r>
+              <w:rPr>
+                <w:rFonts w:ascii="Calibri" w:cs="Calibri" w:eastAsia="Calibri" w:hAnsi="Calibri"/>
+                <w:sz w:val="20"/>
+                <w:szCs w:val="20"/>
+              </w:rPr>
+              <w:t xml:space="preserve"/>
+            </w:r>
+          </w:p>
+        </w:tc>
+      </w:tr>
+      <w:tr>
+        <w:trPr>
+          <w:cantSplit/>
+        </w:trPr>
+        <w:tc>
+          <w:tcPr>
+            <w:tcW w:type="dxa" w:w="1900"/>
+            <w:tcBorders>
+              <w:top w:val="single" w:color="C9D3CD" w:sz="4"/>
+              <w:left w:val="single" w:color="C9D3CD" w:sz="4"/>
+              <w:bottom w:val="single" w:color="C9D3CD" w:sz="4"/>
+              <w:right w:val="single" w:color="C9D3CD" w:sz="4"/>
+            </w:tcBorders>
+            <w:shd w:fill="FAFBFA" w:color="auto" w:val="clear"/>
+            <w:tcMar>
+              <w:top w:type="dxa" w:w="80"/>
+              <w:left w:type="dxa" w:w="110"/>
+              <w:bottom w:type="dxa" w:w="80"/>
+              <w:right w:type="dxa" w:w="110"/>
+            </w:tcMar>
+          </w:tcPr>
+          <w:p>
+            <w:pPr>
+              <w:spacing w:after="0"/>
+            </w:pPr>
+            <w:r>
+              <w:rPr>
+                <w:rFonts w:ascii="Calibri" w:cs="Calibri" w:eastAsia="Calibri" w:hAnsi="Calibri"/>
+                <w:sz w:val="20"/>
+                <w:szCs w:val="20"/>
+              </w:rPr>
+              <w:t xml:space="preserve"/>
+            </w:r>
+          </w:p>
+        </w:tc>
+        <w:tc>
+          <w:tcPr>
+            <w:tcW w:type="dxa" w:w="2300"/>
+            <w:tcBorders>
+              <w:top w:val="single" w:color="C9D3CD" w:sz="4"/>
+              <w:left w:val="single" w:color="C9D3CD" w:sz="4"/>
+              <w:bottom w:val="single" w:color="C9D3CD" w:sz="4"/>
+              <w:right w:val="single" w:color="C9D3CD" w:sz="4"/>
+            </w:tcBorders>
+            <w:shd w:fill="FAFBFA" w:color="auto" w:val="clear"/>
+            <w:tcMar>
+              <w:top w:type="dxa" w:w="80"/>
+              <w:left w:type="dxa" w:w="110"/>
+              <w:bottom w:type="dxa" w:w="80"/>
+              <w:right w:type="dxa" w:w="110"/>
+            </w:tcMar>
+          </w:tcPr>
+          <w:p>
+            <w:pPr>
+              <w:spacing w:after="0"/>
+            </w:pPr>
+            <w:r>
+              <w:rPr>
+                <w:rFonts w:ascii="Calibri" w:cs="Calibri" w:eastAsia="Calibri" w:hAnsi="Calibri"/>
+                <w:sz w:val="20"/>
+                <w:szCs w:val="20"/>
+              </w:rPr>
+              <w:t xml:space="preserve"/>
+            </w:r>
+          </w:p>
+        </w:tc>
+        <w:tc>
+          <w:tcPr>
+            <w:tcW w:type="dxa" w:w="1500"/>
+            <w:tcBorders>
+              <w:top w:val="single" w:color="C9D3CD" w:sz="4"/>
+              <w:left w:val="single" w:color="C9D3CD" w:sz="4"/>
+              <w:bottom w:val="single" w:color="C9D3CD" w:sz="4"/>
+              <w:right w:val="single" w:color="C9D3CD" w:sz="4"/>
+            </w:tcBorders>
+            <w:shd w:fill="FAFBFA" w:color="auto" w:val="clear"/>
+            <w:tcMar>
+              <w:top w:type="dxa" w:w="80"/>
+              <w:left w:type="dxa" w:w="110"/>
+              <w:bottom w:type="dxa" w:w="80"/>
+              <w:right w:type="dxa" w:w="110"/>
+            </w:tcMar>
+          </w:tcPr>
+          <w:p>
+            <w:pPr>
+              <w:spacing w:after="0"/>
+            </w:pPr>
+            <w:r>
+              <w:rPr>
+                <w:rFonts w:ascii="Calibri" w:cs="Calibri" w:eastAsia="Calibri" w:hAnsi="Calibri"/>
+                <w:sz w:val="20"/>
+                <w:szCs w:val="20"/>
+              </w:rPr>
+              <w:t xml:space="preserve"/>
+            </w:r>
+          </w:p>
+        </w:tc>
+        <w:tc>
+          <w:tcPr>
+            <w:tcW w:type="dxa" w:w="1300"/>
+            <w:tcBorders>
+              <w:top w:val="single" w:color="C9D3CD" w:sz="4"/>
+              <w:left w:val="single" w:color="C9D3CD" w:sz="4"/>
+              <w:bottom w:val="single" w:color="C9D3CD" w:sz="4"/>
+              <w:right w:val="single" w:color="C9D3CD" w:sz="4"/>
+            </w:tcBorders>
+            <w:shd w:fill="FAFBFA" w:color="auto" w:val="clear"/>
+            <w:tcMar>
+              <w:top w:type="dxa" w:w="80"/>
+              <w:left w:type="dxa" w:w="110"/>
+              <w:bottom w:type="dxa" w:w="80"/>
+              <w:right w:type="dxa" w:w="110"/>
+            </w:tcMar>
+          </w:tcPr>
+          <w:p>
+            <w:pPr>
+              <w:spacing w:after="0"/>
+            </w:pPr>
+            <w:r>
+              <w:rPr>
+                <w:rFonts w:ascii="Calibri" w:cs="Calibri" w:eastAsia="Calibri" w:hAnsi="Calibri"/>
+                <w:sz w:val="20"/>
+                <w:szCs w:val="20"/>
+              </w:rPr>
+              <w:t xml:space="preserve"/>
+            </w:r>
+          </w:p>
+        </w:tc>
+        <w:tc>
+          <w:tcPr>
+            <w:tcW w:type="dxa" w:w="1438"/>
+            <w:tcBorders>
+              <w:top w:val="single" w:color="C9D3CD" w:sz="4"/>
+              <w:left w:val="single" w:color="C9D3CD" w:sz="4"/>
+              <w:bottom w:val="single" w:color="C9D3CD" w:sz="4"/>
+              <w:right w:val="single" w:color="C9D3CD" w:sz="4"/>
+            </w:tcBorders>
+            <w:shd w:fill="FAFBFA" w:color="auto" w:val="clear"/>
+            <w:tcMar>
+              <w:top w:type="dxa" w:w="80"/>
+              <w:left w:type="dxa" w:w="110"/>
+              <w:bottom w:type="dxa" w:w="80"/>
+              <w:right w:type="dxa" w:w="110"/>
+            </w:tcMar>
+          </w:tcPr>
+          <w:p>
+            <w:pPr>
+              <w:spacing w:after="0"/>
+            </w:pPr>
+            <w:r>
+              <w:rPr>
+                <w:rFonts w:ascii="Calibri" w:cs="Calibri" w:eastAsia="Calibri" w:hAnsi="Calibri"/>
+                <w:sz w:val="20"/>
+                <w:szCs w:val="20"/>
+              </w:rPr>
+              <w:t xml:space="preserve"/>
+            </w:r>
+          </w:p>
+        </w:tc>
+        <w:tc>
+          <w:tcPr>
+            <w:tcW w:type="dxa" w:w="1200"/>
+            <w:tcBorders>
+              <w:top w:val="single" w:color="C9D3CD" w:sz="4"/>
+              <w:left w:val="single" w:color="C9D3CD" w:sz="4"/>
+              <w:bottom w:val="single" w:color="C9D3CD" w:sz="4"/>
+              <w:right w:val="single" w:color="C9D3CD" w:sz="4"/>
+            </w:tcBorders>
+            <w:shd w:fill="FAFBFA" w:color="auto" w:val="clear"/>
+            <w:tcMar>
+              <w:top w:type="dxa" w:w="80"/>
+              <w:left w:type="dxa" w:w="110"/>
+              <w:bottom w:type="dxa" w:w="80"/>
+              <w:right w:type="dxa" w:w="110"/>
+            </w:tcMar>
+          </w:tcPr>
+          <w:p>
+            <w:pPr>
+              <w:spacing w:after="0"/>
+            </w:pPr>
+            <w:r>
+              <w:rPr>
+                <w:rFonts w:ascii="Calibri" w:cs="Calibri" w:eastAsia="Calibri" w:hAnsi="Calibri"/>
+                <w:sz w:val="20"/>
+                <w:szCs w:val="20"/>
+              </w:rPr>
+              <w:t xml:space="preserve"/>
+            </w:r>
+          </w:p>
+        </w:tc>
+      </w:tr>
+      <w:tr>
+        <w:trPr>
+          <w:cantSplit/>
+        </w:trPr>
+        <w:tc>
+          <w:tcPr>
+            <w:tcW w:type="dxa" w:w="1900"/>
+            <w:tcBorders>
+              <w:top w:val="single" w:color="C9D3CD" w:sz="4"/>
+              <w:left w:val="single" w:color="C9D3CD" w:sz="4"/>
+              <w:bottom w:val="single" w:color="C9D3CD" w:sz="4"/>
+              <w:right w:val="single" w:color="C9D3CD" w:sz="4"/>
+            </w:tcBorders>
+            <w:shd w:fill="FFFFFF" w:color="auto" w:val="clear"/>
+            <w:tcMar>
+              <w:top w:type="dxa" w:w="80"/>
+              <w:left w:type="dxa" w:w="110"/>
+              <w:bottom w:type="dxa" w:w="80"/>
+              <w:right w:type="dxa" w:w="110"/>
+            </w:tcMar>
+          </w:tcPr>
+          <w:p>
+            <w:pPr>
+              <w:spacing w:after="0"/>
+            </w:pPr>
+            <w:r>
+              <w:rPr>
+                <w:rFonts w:ascii="Calibri" w:cs="Calibri" w:eastAsia="Calibri" w:hAnsi="Calibri"/>
+                <w:sz w:val="20"/>
+                <w:szCs w:val="20"/>
+              </w:rPr>
+              <w:t xml:space="preserve"/>
+            </w:r>
+          </w:p>
+        </w:tc>
+        <w:tc>
+          <w:tcPr>
+            <w:tcW w:type="dxa" w:w="2300"/>
+            <w:tcBorders>
+              <w:top w:val="single" w:color="C9D3CD" w:sz="4"/>
+              <w:left w:val="single" w:color="C9D3CD" w:sz="4"/>
+              <w:bottom w:val="single" w:color="C9D3CD" w:sz="4"/>
+              <w:right w:val="single" w:color="C9D3CD" w:sz="4"/>
+            </w:tcBorders>
+            <w:shd w:fill="FFFFFF" w:color="auto" w:val="clear"/>
+            <w:tcMar>
+              <w:top w:type="dxa" w:w="80"/>
+              <w:left w:type="dxa" w:w="110"/>
+              <w:bottom w:type="dxa" w:w="80"/>
+              <w:right w:type="dxa" w:w="110"/>
+            </w:tcMar>
+          </w:tcPr>
+          <w:p>
+            <w:pPr>
+              <w:spacing w:after="0"/>
+            </w:pPr>
+            <w:r>
+              <w:rPr>
+                <w:rFonts w:ascii="Calibri" w:cs="Calibri" w:eastAsia="Calibri" w:hAnsi="Calibri"/>
+                <w:sz w:val="20"/>
+                <w:szCs w:val="20"/>
+              </w:rPr>
+              <w:t xml:space="preserve"/>
+            </w:r>
+          </w:p>
+        </w:tc>
+        <w:tc>
+          <w:tcPr>
+            <w:tcW w:type="dxa" w:w="1500"/>
+            <w:tcBorders>
+              <w:top w:val="single" w:color="C9D3CD" w:sz="4"/>
+              <w:left w:val="single" w:color="C9D3CD" w:sz="4"/>
+              <w:bottom w:val="single" w:color="C9D3CD" w:sz="4"/>
+              <w:right w:val="single" w:color="C9D3CD" w:sz="4"/>
+            </w:tcBorders>
+            <w:shd w:fill="FFFFFF" w:color="auto" w:val="clear"/>
+            <w:tcMar>
+              <w:top w:type="dxa" w:w="80"/>
+              <w:left w:type="dxa" w:w="110"/>
+              <w:bottom w:type="dxa" w:w="80"/>
+              <w:right w:type="dxa" w:w="110"/>
+            </w:tcMar>
+          </w:tcPr>
+          <w:p>
+            <w:pPr>
+              <w:spacing w:after="0"/>
+            </w:pPr>
+            <w:r>
+              <w:rPr>
+                <w:rFonts w:ascii="Calibri" w:cs="Calibri" w:eastAsia="Calibri" w:hAnsi="Calibri"/>
+                <w:sz w:val="20"/>
+                <w:szCs w:val="20"/>
+              </w:rPr>
+              <w:t xml:space="preserve"/>
+            </w:r>
+          </w:p>
+        </w:tc>
+        <w:tc>
+          <w:tcPr>
+            <w:tcW w:type="dxa" w:w="1300"/>
+            <w:tcBorders>
+              <w:top w:val="single" w:color="C9D3CD" w:sz="4"/>
+              <w:left w:val="single" w:color="C9D3CD" w:sz="4"/>
+              <w:bottom w:val="single" w:color="C9D3CD" w:sz="4"/>
+              <w:right w:val="single" w:color="C9D3CD" w:sz="4"/>
+            </w:tcBorders>
+            <w:shd w:fill="FFFFFF" w:color="auto" w:val="clear"/>
+            <w:tcMar>
+              <w:top w:type="dxa" w:w="80"/>
+              <w:left w:type="dxa" w:w="110"/>
+              <w:bottom w:type="dxa" w:w="80"/>
+              <w:right w:type="dxa" w:w="110"/>
+            </w:tcMar>
+          </w:tcPr>
+          <w:p>
+            <w:pPr>
+              <w:spacing w:after="0"/>
+            </w:pPr>
+            <w:r>
+              <w:rPr>
+                <w:rFonts w:ascii="Calibri" w:cs="Calibri" w:eastAsia="Calibri" w:hAnsi="Calibri"/>
+                <w:sz w:val="20"/>
+                <w:szCs w:val="20"/>
+              </w:rPr>
+              <w:t xml:space="preserve"/>
+            </w:r>
+          </w:p>
+        </w:tc>
+        <w:tc>
+          <w:tcPr>
+            <w:tcW w:type="dxa" w:w="1438"/>
+            <w:tcBorders>
+              <w:top w:val="single" w:color="C9D3CD" w:sz="4"/>
+              <w:left w:val="single" w:color="C9D3CD" w:sz="4"/>
+              <w:bottom w:val="single" w:color="C9D3CD" w:sz="4"/>
+              <w:right w:val="single" w:color="C9D3CD" w:sz="4"/>
+            </w:tcBorders>
+            <w:shd w:fill="FFFFFF" w:color="auto" w:val="clear"/>
+            <w:tcMar>
+              <w:top w:type="dxa" w:w="80"/>
+              <w:left w:type="dxa" w:w="110"/>
+              <w:bottom w:type="dxa" w:w="80"/>
+              <w:right w:type="dxa" w:w="110"/>
+            </w:tcMar>
+          </w:tcPr>
+          <w:p>
+            <w:pPr>
+              <w:spacing w:after="0"/>
+            </w:pPr>
+            <w:r>
+              <w:rPr>
+                <w:rFonts w:ascii="Calibri" w:cs="Calibri" w:eastAsia="Calibri" w:hAnsi="Calibri"/>
+                <w:sz w:val="20"/>
+                <w:szCs w:val="20"/>
+              </w:rPr>
+              <w:t xml:space="preserve"/>
+            </w:r>
+          </w:p>
+        </w:tc>
+        <w:tc>
+          <w:tcPr>
+            <w:tcW w:type="dxa" w:w="1200"/>
+            <w:tcBorders>
+              <w:top w:val="single" w:color="C9D3CD" w:sz="4"/>
+              <w:left w:val="single" w:color="C9D3CD" w:sz="4"/>
+              <w:bottom w:val="single" w:color="C9D3CD" w:sz="4"/>
+              <w:right w:val="single" w:color="C9D3CD" w:sz="4"/>
+            </w:tcBorders>
+            <w:shd w:fill="FFFFFF" w:color="auto" w:val="clear"/>
+            <w:tcMar>
+              <w:top w:type="dxa" w:w="80"/>
+              <w:left w:type="dxa" w:w="110"/>
+              <w:bottom w:type="dxa" w:w="80"/>
+              <w:right w:type="dxa" w:w="110"/>
+            </w:tcMar>
+          </w:tcPr>
+          <w:p>
+            <w:pPr>
+              <w:spacing w:after="0"/>
+            </w:pPr>
+            <w:r>
+              <w:rPr>
+                <w:rFonts w:ascii="Calibri" w:cs="Calibri" w:eastAsia="Calibri" w:hAnsi="Calibri"/>
+                <w:sz w:val="20"/>
+                <w:szCs w:val="20"/>
+              </w:rPr>
+              <w:t xml:space="preserve"/>
+            </w:r>
+          </w:p>
+        </w:tc>
+      </w:tr>
+      <w:tr>
+        <w:trPr>
+          <w:cantSplit/>
+        </w:trPr>
+        <w:tc>
+          <w:tcPr>
+            <w:tcW w:type="dxa" w:w="1900"/>
+            <w:tcBorders>
+              <w:top w:val="single" w:color="C9D3CD" w:sz="4"/>
+              <w:left w:val="single" w:color="C9D3CD" w:sz="4"/>
+              <w:bottom w:val="single" w:color="C9D3CD" w:sz="4"/>
+              <w:right w:val="single" w:color="C9D3CD" w:sz="4"/>
+            </w:tcBorders>
+            <w:shd w:fill="FAFBFA" w:color="auto" w:val="clear"/>
+            <w:tcMar>
+              <w:top w:type="dxa" w:w="80"/>
+              <w:left w:type="dxa" w:w="110"/>
+              <w:bottom w:type="dxa" w:w="80"/>
+              <w:right w:type="dxa" w:w="110"/>
+            </w:tcMar>
+          </w:tcPr>
+          <w:p>
+            <w:pPr>
+              <w:spacing w:after="0"/>
+            </w:pPr>
+            <w:r>
+              <w:rPr>
+                <w:rFonts w:ascii="Calibri" w:cs="Calibri" w:eastAsia="Calibri" w:hAnsi="Calibri"/>
+                <w:sz w:val="20"/>
+                <w:szCs w:val="20"/>
+              </w:rPr>
+              <w:t xml:space="preserve"/>
+            </w:r>
+          </w:p>
+        </w:tc>
+        <w:tc>
+          <w:tcPr>
+            <w:tcW w:type="dxa" w:w="2300"/>
+            <w:tcBorders>
+              <w:top w:val="single" w:color="C9D3CD" w:sz="4"/>
+              <w:left w:val="single" w:color="C9D3CD" w:sz="4"/>
+              <w:bottom w:val="single" w:color="C9D3CD" w:sz="4"/>
+              <w:right w:val="single" w:color="C9D3CD" w:sz="4"/>
+            </w:tcBorders>
+            <w:shd w:fill="FAFBFA" w:color="auto" w:val="clear"/>
+            <w:tcMar>
+              <w:top w:type="dxa" w:w="80"/>
+              <w:left w:type="dxa" w:w="110"/>
+              <w:bottom w:type="dxa" w:w="80"/>
+              <w:right w:type="dxa" w:w="110"/>
+            </w:tcMar>
+          </w:tcPr>
+          <w:p>
+            <w:pPr>
+              <w:spacing w:after="0"/>
+            </w:pPr>
+            <w:r>
+              <w:rPr>
+                <w:rFonts w:ascii="Calibri" w:cs="Calibri" w:eastAsia="Calibri" w:hAnsi="Calibri"/>
+                <w:sz w:val="20"/>
+                <w:szCs w:val="20"/>
+              </w:rPr>
+              <w:t xml:space="preserve"/>
+            </w:r>
+          </w:p>
+        </w:tc>
+        <w:tc>
+          <w:tcPr>
+            <w:tcW w:type="dxa" w:w="1500"/>
+            <w:tcBorders>
+              <w:top w:val="single" w:color="C9D3CD" w:sz="4"/>
+              <w:left w:val="single" w:color="C9D3CD" w:sz="4"/>
+              <w:bottom w:val="single" w:color="C9D3CD" w:sz="4"/>
+              <w:right w:val="single" w:color="C9D3CD" w:sz="4"/>
+            </w:tcBorders>
+            <w:shd w:fill="FAFBFA" w:color="auto" w:val="clear"/>
+            <w:tcMar>
+              <w:top w:type="dxa" w:w="80"/>
+              <w:left w:type="dxa" w:w="110"/>
+              <w:bottom w:type="dxa" w:w="80"/>
+              <w:right w:type="dxa" w:w="110"/>
+            </w:tcMar>
+          </w:tcPr>
+          <w:p>
+            <w:pPr>
+              <w:spacing w:after="0"/>
+            </w:pPr>
+            <w:r>
+              <w:rPr>
+                <w:rFonts w:ascii="Calibri" w:cs="Calibri" w:eastAsia="Calibri" w:hAnsi="Calibri"/>
+                <w:sz w:val="20"/>
+                <w:szCs w:val="20"/>
+              </w:rPr>
+              <w:t xml:space="preserve"/>
+            </w:r>
+          </w:p>
+        </w:tc>
+        <w:tc>
+          <w:tcPr>
+            <w:tcW w:type="dxa" w:w="1300"/>
+            <w:tcBorders>
+              <w:top w:val="single" w:color="C9D3CD" w:sz="4"/>
+              <w:left w:val="single" w:color="C9D3CD" w:sz="4"/>
+              <w:bottom w:val="single" w:color="C9D3CD" w:sz="4"/>
+              <w:right w:val="single" w:color="C9D3CD" w:sz="4"/>
+            </w:tcBorders>
+            <w:shd w:fill="FAFBFA" w:color="auto" w:val="clear"/>
+            <w:tcMar>
+              <w:top w:type="dxa" w:w="80"/>
+              <w:left w:type="dxa" w:w="110"/>
+              <w:bottom w:type="dxa" w:w="80"/>
+              <w:right w:type="dxa" w:w="110"/>
+            </w:tcMar>
+          </w:tcPr>
+          <w:p>
+            <w:pPr>
+              <w:spacing w:after="0"/>
+            </w:pPr>
+            <w:r>
+              <w:rPr>
+                <w:rFonts w:ascii="Calibri" w:cs="Calibri" w:eastAsia="Calibri" w:hAnsi="Calibri"/>
+                <w:sz w:val="20"/>
+                <w:szCs w:val="20"/>
+              </w:rPr>
+              <w:t xml:space="preserve"/>
+            </w:r>
+          </w:p>
+        </w:tc>
+        <w:tc>
+          <w:tcPr>
+            <w:tcW w:type="dxa" w:w="1438"/>
+            <w:tcBorders>
+              <w:top w:val="single" w:color="C9D3CD" w:sz="4"/>
+              <w:left w:val="single" w:color="C9D3CD" w:sz="4"/>
+              <w:bottom w:val="single" w:color="C9D3CD" w:sz="4"/>
+              <w:right w:val="single" w:color="C9D3CD" w:sz="4"/>
+            </w:tcBorders>
+            <w:shd w:fill="FAFBFA" w:color="auto" w:val="clear"/>
+            <w:tcMar>
+              <w:top w:type="dxa" w:w="80"/>
+              <w:left w:type="dxa" w:w="110"/>
+              <w:bottom w:type="dxa" w:w="80"/>
+              <w:right w:type="dxa" w:w="110"/>
+            </w:tcMar>
+          </w:tcPr>
+          <w:p>
+            <w:pPr>
+              <w:spacing w:after="0"/>
+            </w:pPr>
+            <w:r>
+              <w:rPr>
+                <w:rFonts w:ascii="Calibri" w:cs="Calibri" w:eastAsia="Calibri" w:hAnsi="Calibri"/>
+                <w:sz w:val="20"/>
+                <w:szCs w:val="20"/>
+              </w:rPr>
+              <w:t xml:space="preserve"/>
+            </w:r>
+          </w:p>
+        </w:tc>
+        <w:tc>
+          <w:tcPr>
+            <w:tcW w:type="dxa" w:w="1200"/>
+            <w:tcBorders>
+              <w:top w:val="single" w:color="C9D3CD" w:sz="4"/>
+              <w:left w:val="single" w:color="C9D3CD" w:sz="4"/>
+              <w:bottom w:val="single" w:color="C9D3CD" w:sz="4"/>
+              <w:right w:val="single" w:color="C9D3CD" w:sz="4"/>
+            </w:tcBorders>
+            <w:shd w:fill="FAFBFA" w:color="auto" w:val="clear"/>
+            <w:tcMar>
+              <w:top w:type="dxa" w:w="80"/>
+              <w:left w:type="dxa" w:w="110"/>
+              <w:bottom w:type="dxa" w:w="80"/>
+              <w:right w:type="dxa" w:w="110"/>
+            </w:tcMar>
+          </w:tcPr>
+          <w:p>
+            <w:pPr>
+              <w:spacing w:after="0"/>
+            </w:pPr>
+            <w:r>
+              <w:rPr>
+                <w:rFonts w:ascii="Calibri" w:cs="Calibri" w:eastAsia="Calibri" w:hAnsi="Calibri"/>
+                <w:sz w:val="20"/>
+                <w:szCs w:val="20"/>
+              </w:rPr>
+              <w:t xml:space="preserve"/>
+            </w:r>
+          </w:p>
+        </w:tc>
+      </w:tr>
+      <w:tr>
+        <w:trPr>
+          <w:cantSplit/>
+        </w:trPr>
+        <w:tc>
+          <w:tcPr>
+            <w:tcW w:type="dxa" w:w="1900"/>
+            <w:tcBorders>
+              <w:top w:val="single" w:color="C9D3CD" w:sz="4"/>
+              <w:left w:val="single" w:color="C9D3CD" w:sz="4"/>
+              <w:bottom w:val="single" w:color="C9D3CD" w:sz="4"/>
+              <w:right w:val="single" w:color="C9D3CD" w:sz="4"/>
+            </w:tcBorders>
+            <w:shd w:fill="FFFFFF" w:color="auto" w:val="clear"/>
+            <w:tcMar>
+              <w:top w:type="dxa" w:w="80"/>
+              <w:left w:type="dxa" w:w="110"/>
+              <w:bottom w:type="dxa" w:w="80"/>
+              <w:right w:type="dxa" w:w="110"/>
+            </w:tcMar>
+          </w:tcPr>
+          <w:p>
+            <w:pPr>
+              <w:spacing w:after="0"/>
+            </w:pPr>
+            <w:r>
+              <w:rPr>
+                <w:rFonts w:ascii="Calibri" w:cs="Calibri" w:eastAsia="Calibri" w:hAnsi="Calibri"/>
+                <w:sz w:val="20"/>
+                <w:szCs w:val="20"/>
+              </w:rPr>
+              <w:t xml:space="preserve"/>
+            </w:r>
+          </w:p>
+        </w:tc>
+        <w:tc>
+          <w:tcPr>
+            <w:tcW w:type="dxa" w:w="2300"/>
+            <w:tcBorders>
+              <w:top w:val="single" w:color="C9D3CD" w:sz="4"/>
+              <w:left w:val="single" w:color="C9D3CD" w:sz="4"/>
+              <w:bottom w:val="single" w:color="C9D3CD" w:sz="4"/>
+              <w:right w:val="single" w:color="C9D3CD" w:sz="4"/>
+            </w:tcBorders>
+            <w:shd w:fill="FFFFFF" w:color="auto" w:val="clear"/>
+            <w:tcMar>
+              <w:top w:type="dxa" w:w="80"/>
+              <w:left w:type="dxa" w:w="110"/>
+              <w:bottom w:type="dxa" w:w="80"/>
+              <w:right w:type="dxa" w:w="110"/>
+            </w:tcMar>
+          </w:tcPr>
+          <w:p>
+            <w:pPr>
+              <w:spacing w:after="0"/>
+            </w:pPr>
+            <w:r>
+              <w:rPr>
+                <w:rFonts w:ascii="Calibri" w:cs="Calibri" w:eastAsia="Calibri" w:hAnsi="Calibri"/>
+                <w:sz w:val="20"/>
+                <w:szCs w:val="20"/>
+              </w:rPr>
+              <w:t xml:space="preserve"/>
+            </w:r>
+          </w:p>
+        </w:tc>
+        <w:tc>
+          <w:tcPr>
+            <w:tcW w:type="dxa" w:w="1500"/>
+            <w:tcBorders>
+              <w:top w:val="single" w:color="C9D3CD" w:sz="4"/>
+              <w:left w:val="single" w:color="C9D3CD" w:sz="4"/>
+              <w:bottom w:val="single" w:color="C9D3CD" w:sz="4"/>
+              <w:right w:val="single" w:color="C9D3CD" w:sz="4"/>
+            </w:tcBorders>
+            <w:shd w:fill="FFFFFF" w:color="auto" w:val="clear"/>
+            <w:tcMar>
+              <w:top w:type="dxa" w:w="80"/>
+              <w:left w:type="dxa" w:w="110"/>
+              <w:bottom w:type="dxa" w:w="80"/>
+              <w:right w:type="dxa" w:w="110"/>
+            </w:tcMar>
+          </w:tcPr>
+          <w:p>
+            <w:pPr>
+              <w:spacing w:after="0"/>
+            </w:pPr>
+            <w:r>
+              <w:rPr>
+                <w:rFonts w:ascii="Calibri" w:cs="Calibri" w:eastAsia="Calibri" w:hAnsi="Calibri"/>
+                <w:sz w:val="20"/>
+                <w:szCs w:val="20"/>
+              </w:rPr>
+              <w:t xml:space="preserve"/>
+            </w:r>
+          </w:p>
+        </w:tc>
+        <w:tc>
+          <w:tcPr>
+            <w:tcW w:type="dxa" w:w="1300"/>
+            <w:tcBorders>
+              <w:top w:val="single" w:color="C9D3CD" w:sz="4"/>
+              <w:left w:val="single" w:color="C9D3CD" w:sz="4"/>
+              <w:bottom w:val="single" w:color="C9D3CD" w:sz="4"/>
+              <w:right w:val="single" w:color="C9D3CD" w:sz="4"/>
+            </w:tcBorders>
+            <w:shd w:fill="FFFFFF" w:color="auto" w:val="clear"/>
+            <w:tcMar>
+              <w:top w:type="dxa" w:w="80"/>
+              <w:left w:type="dxa" w:w="110"/>
+              <w:bottom w:type="dxa" w:w="80"/>
+              <w:right w:type="dxa" w:w="110"/>
+            </w:tcMar>
+          </w:tcPr>
+          <w:p>
+            <w:pPr>
+              <w:spacing w:after="0"/>
+            </w:pPr>
+            <w:r>
+              <w:rPr>
+                <w:rFonts w:ascii="Calibri" w:cs="Calibri" w:eastAsia="Calibri" w:hAnsi="Calibri"/>
+                <w:sz w:val="20"/>
+                <w:szCs w:val="20"/>
+              </w:rPr>
+              <w:t xml:space="preserve"/>
+            </w:r>
+          </w:p>
+        </w:tc>
+        <w:tc>
+          <w:tcPr>
+            <w:tcW w:type="dxa" w:w="1438"/>
+            <w:tcBorders>
+              <w:top w:val="single" w:color="C9D3CD" w:sz="4"/>
+              <w:left w:val="single" w:color="C9D3CD" w:sz="4"/>
+              <w:bottom w:val="single" w:color="C9D3CD" w:sz="4"/>
+              <w:right w:val="single" w:color="C9D3CD" w:sz="4"/>
+            </w:tcBorders>
+            <w:shd w:fill="FFFFFF" w:color="auto" w:val="clear"/>
+            <w:tcMar>
+              <w:top w:type="dxa" w:w="80"/>
+              <w:left w:type="dxa" w:w="110"/>
+              <w:bottom w:type="dxa" w:w="80"/>
+              <w:right w:type="dxa" w:w="110"/>
+            </w:tcMar>
+          </w:tcPr>
+          <w:p>
+            <w:pPr>
+              <w:spacing w:after="0"/>
+            </w:pPr>
+            <w:r>
+              <w:rPr>
+                <w:rFonts w:ascii="Calibri" w:cs="Calibri" w:eastAsia="Calibri" w:hAnsi="Calibri"/>
+                <w:sz w:val="20"/>
+                <w:szCs w:val="20"/>
+              </w:rPr>
+              <w:t xml:space="preserve"/>
+            </w:r>
+          </w:p>
+        </w:tc>
+        <w:tc>
+          <w:tcPr>
+            <w:tcW w:type="dxa" w:w="1200"/>
+            <w:tcBorders>
+              <w:top w:val="single" w:color="C9D3CD" w:sz="4"/>
+              <w:left w:val="single" w:color="C9D3CD" w:sz="4"/>
+              <w:bottom w:val="single" w:color="C9D3CD" w:sz="4"/>
+              <w:right w:val="single" w:color="C9D3CD" w:sz="4"/>
+            </w:tcBorders>
+            <w:shd w:fill="FFFFFF" w:color="auto" w:val="clear"/>
+            <w:tcMar>
+              <w:top w:type="dxa" w:w="80"/>
+              <w:left w:type="dxa" w:w="110"/>
+              <w:bottom w:type="dxa" w:w="80"/>
+              <w:right w:type="dxa" w:w="110"/>
+            </w:tcMar>
+          </w:tcPr>
+          <w:p>
+            <w:pPr>
+              <w:spacing w:after="0"/>
+            </w:pPr>
+            <w:r>
+              <w:rPr>
+                <w:rFonts w:ascii="Calibri" w:cs="Calibri" w:eastAsia="Calibri" w:hAnsi="Calibri"/>
+                <w:sz w:val="20"/>
+                <w:szCs w:val="20"/>
+              </w:rPr>
+              <w:t xml:space="preserve"/>
+            </w:r>
+          </w:p>
+        </w:tc>
+      </w:tr>
+      <w:tr>
+        <w:trPr>
+          <w:cantSplit/>
+        </w:trPr>
+        <w:tc>
+          <w:tcPr>
+            <w:tcW w:type="dxa" w:w="1900"/>
+            <w:tcBorders>
+              <w:top w:val="single" w:color="C9D3CD" w:sz="4"/>
+              <w:left w:val="single" w:color="C9D3CD" w:sz="4"/>
+              <w:bottom w:val="single" w:color="C9D3CD" w:sz="4"/>
+              <w:right w:val="single" w:color="C9D3CD" w:sz="4"/>
+            </w:tcBorders>
+            <w:shd w:fill="FAFBFA" w:color="auto" w:val="clear"/>
+            <w:tcMar>
+              <w:top w:type="dxa" w:w="80"/>
+              <w:left w:type="dxa" w:w="110"/>
+              <w:bottom w:type="dxa" w:w="80"/>
+              <w:right w:type="dxa" w:w="110"/>
+            </w:tcMar>
+          </w:tcPr>
+          <w:p>
+            <w:pPr>
+              <w:spacing w:after="0"/>
+            </w:pPr>
+            <w:r>
+              <w:rPr>
+                <w:rFonts w:ascii="Calibri" w:cs="Calibri" w:eastAsia="Calibri" w:hAnsi="Calibri"/>
+                <w:sz w:val="20"/>
+                <w:szCs w:val="20"/>
+              </w:rPr>
+              <w:t xml:space="preserve"/>
+            </w:r>
+          </w:p>
+        </w:tc>
+        <w:tc>
+          <w:tcPr>
+            <w:tcW w:type="dxa" w:w="2300"/>
+            <w:tcBorders>
+              <w:top w:val="single" w:color="C9D3CD" w:sz="4"/>
+              <w:left w:val="single" w:color="C9D3CD" w:sz="4"/>
+              <w:bottom w:val="single" w:color="C9D3CD" w:sz="4"/>
+              <w:right w:val="single" w:color="C9D3CD" w:sz="4"/>
+            </w:tcBorders>
+            <w:shd w:fill="FAFBFA" w:color="auto" w:val="clear"/>
+            <w:tcMar>
+              <w:top w:type="dxa" w:w="80"/>
+              <w:left w:type="dxa" w:w="110"/>
+              <w:bottom w:type="dxa" w:w="80"/>
+              <w:right w:type="dxa" w:w="110"/>
+            </w:tcMar>
+          </w:tcPr>
+          <w:p>
+            <w:pPr>
+              <w:spacing w:after="0"/>
+            </w:pPr>
+            <w:r>
+              <w:rPr>
+                <w:rFonts w:ascii="Calibri" w:cs="Calibri" w:eastAsia="Calibri" w:hAnsi="Calibri"/>
+                <w:sz w:val="20"/>
+                <w:szCs w:val="20"/>
+              </w:rPr>
+              <w:t xml:space="preserve"/>
+            </w:r>
+          </w:p>
+        </w:tc>
+        <w:tc>
+          <w:tcPr>
+            <w:tcW w:type="dxa" w:w="1500"/>
+            <w:tcBorders>
+              <w:top w:val="single" w:color="C9D3CD" w:sz="4"/>
+              <w:left w:val="single" w:color="C9D3CD" w:sz="4"/>
+              <w:bottom w:val="single" w:color="C9D3CD" w:sz="4"/>
+              <w:right w:val="single" w:color="C9D3CD" w:sz="4"/>
+            </w:tcBorders>
+            <w:shd w:fill="FAFBFA" w:color="auto" w:val="clear"/>
+            <w:tcMar>
+              <w:top w:type="dxa" w:w="80"/>
+              <w:left w:type="dxa" w:w="110"/>
+              <w:bottom w:type="dxa" w:w="80"/>
+              <w:right w:type="dxa" w:w="110"/>
+            </w:tcMar>
+          </w:tcPr>
+          <w:p>
+            <w:pPr>
+              <w:spacing w:after="0"/>
+            </w:pPr>
+            <w:r>
+              <w:rPr>
+                <w:rFonts w:ascii="Calibri" w:cs="Calibri" w:eastAsia="Calibri" w:hAnsi="Calibri"/>
+                <w:sz w:val="20"/>
+                <w:szCs w:val="20"/>
+              </w:rPr>
+              <w:t xml:space="preserve"/>
+            </w:r>
+          </w:p>
+        </w:tc>
+        <w:tc>
+          <w:tcPr>
+            <w:tcW w:type="dxa" w:w="1300"/>
+            <w:tcBorders>
+              <w:top w:val="single" w:color="C9D3CD" w:sz="4"/>
+              <w:left w:val="single" w:color="C9D3CD" w:sz="4"/>
+              <w:bottom w:val="single" w:color="C9D3CD" w:sz="4"/>
+              <w:right w:val="single" w:color="C9D3CD" w:sz="4"/>
+            </w:tcBorders>
+            <w:shd w:fill="FAFBFA" w:color="auto" w:val="clear"/>
+            <w:tcMar>
+              <w:top w:type="dxa" w:w="80"/>
+              <w:left w:type="dxa" w:w="110"/>
+              <w:bottom w:type="dxa" w:w="80"/>
+              <w:right w:type="dxa" w:w="110"/>
+            </w:tcMar>
+          </w:tcPr>
+          <w:p>
+            <w:pPr>
+              <w:spacing w:after="0"/>
+            </w:pPr>
+            <w:r>
+              <w:rPr>
+                <w:rFonts w:ascii="Calibri" w:cs="Calibri" w:eastAsia="Calibri" w:hAnsi="Calibri"/>
+                <w:sz w:val="20"/>
+                <w:szCs w:val="20"/>
+              </w:rPr>
+              <w:t xml:space="preserve"/>
+            </w:r>
+          </w:p>
+        </w:tc>
+        <w:tc>
+          <w:tcPr>
+            <w:tcW w:type="dxa" w:w="1438"/>
+            <w:tcBorders>
+              <w:top w:val="single" w:color="C9D3CD" w:sz="4"/>
+              <w:left w:val="single" w:color="C9D3CD" w:sz="4"/>
+              <w:bottom w:val="single" w:color="C9D3CD" w:sz="4"/>
+              <w:right w:val="single" w:color="C9D3CD" w:sz="4"/>
+            </w:tcBorders>
+            <w:shd w:fill="FAFBFA" w:color="auto" w:val="clear"/>
+            <w:tcMar>
+              <w:top w:type="dxa" w:w="80"/>
+              <w:left w:type="dxa" w:w="110"/>
+              <w:bottom w:type="dxa" w:w="80"/>
+              <w:right w:type="dxa" w:w="110"/>
+            </w:tcMar>
+          </w:tcPr>
+          <w:p>
+            <w:pPr>
+              <w:spacing w:after="0"/>
+            </w:pPr>
+            <w:r>
+              <w:rPr>
+                <w:rFonts w:ascii="Calibri" w:cs="Calibri" w:eastAsia="Calibri" w:hAnsi="Calibri"/>
+                <w:sz w:val="20"/>
+                <w:szCs w:val="20"/>
+              </w:rPr>
+              <w:t xml:space="preserve"/>
+            </w:r>
+          </w:p>
+        </w:tc>
+        <w:tc>
+          <w:tcPr>
+            <w:tcW w:type="dxa" w:w="1200"/>
+            <w:tcBorders>
+              <w:top w:val="single" w:color="C9D3CD" w:sz="4"/>
+              <w:left w:val="single" w:color="C9D3CD" w:sz="4"/>
+              <w:bottom w:val="single" w:color="C9D3CD" w:sz="4"/>
+              <w:right w:val="single" w:color="C9D3CD" w:sz="4"/>
+            </w:tcBorders>
+            <w:shd w:fill="FAFBFA" w:color="auto" w:val="clear"/>
+            <w:tcMar>
+              <w:top w:type="dxa" w:w="80"/>
+              <w:left w:type="dxa" w:w="110"/>
+              <w:bottom w:type="dxa" w:w="80"/>
+              <w:right w:type="dxa" w:w="110"/>
+            </w:tcMar>
+          </w:tcPr>
+          <w:p>
+            <w:pPr>
+              <w:spacing w:after="0"/>
+            </w:pPr>
+            <w:r>
+              <w:rPr>
+                <w:rFonts w:ascii="Calibri" w:cs="Calibri" w:eastAsia="Calibri" w:hAnsi="Calibri"/>
+                <w:sz w:val="20"/>
+                <w:szCs w:val="20"/>
+              </w:rPr>
+              <w:t xml:space="preserve"/>
+            </w:r>
+          </w:p>
+        </w:tc>
+      </w:tr>
+      <w:tr>
+        <w:trPr>
+          <w:cantSplit/>
+        </w:trPr>
+        <w:tc>
+          <w:tcPr>
+            <w:tcW w:type="dxa" w:w="1900"/>
+            <w:tcBorders>
+              <w:top w:val="single" w:color="C9D3CD" w:sz="4"/>
+              <w:left w:val="single" w:color="C9D3CD" w:sz="4"/>
+              <w:bottom w:val="single" w:color="C9D3CD" w:sz="4"/>
+              <w:right w:val="single" w:color="C9D3CD" w:sz="4"/>
+            </w:tcBorders>
+            <w:shd w:fill="FFFFFF" w:color="auto" w:val="clear"/>
+            <w:tcMar>
+              <w:top w:type="dxa" w:w="80"/>
+              <w:left w:type="dxa" w:w="110"/>
+              <w:bottom w:type="dxa" w:w="80"/>
+              <w:right w:type="dxa" w:w="110"/>
+            </w:tcMar>
+          </w:tcPr>
+          <w:p>
+            <w:pPr>
+              <w:spacing w:after="0"/>
+            </w:pPr>
+            <w:r>
+              <w:rPr>
+                <w:rFonts w:ascii="Calibri" w:cs="Calibri" w:eastAsia="Calibri" w:hAnsi="Calibri"/>
+                <w:sz w:val="20"/>
+                <w:szCs w:val="20"/>
+              </w:rPr>
+              <w:t xml:space="preserve"/>
+            </w:r>
+          </w:p>
+        </w:tc>
+        <w:tc>
+          <w:tcPr>
+            <w:tcW w:type="dxa" w:w="2300"/>
+            <w:tcBorders>
+              <w:top w:val="single" w:color="C9D3CD" w:sz="4"/>
+              <w:left w:val="single" w:color="C9D3CD" w:sz="4"/>
+              <w:bottom w:val="single" w:color="C9D3CD" w:sz="4"/>
+              <w:right w:val="single" w:color="C9D3CD" w:sz="4"/>
+            </w:tcBorders>
+            <w:shd w:fill="FFFFFF" w:color="auto" w:val="clear"/>
+            <w:tcMar>
+              <w:top w:type="dxa" w:w="80"/>
+              <w:left w:type="dxa" w:w="110"/>
+              <w:bottom w:type="dxa" w:w="80"/>
+              <w:right w:type="dxa" w:w="110"/>
+            </w:tcMar>
+          </w:tcPr>
+          <w:p>
+            <w:pPr>
+              <w:spacing w:after="0"/>
+            </w:pPr>
+            <w:r>
+              <w:rPr>
+                <w:rFonts w:ascii="Calibri" w:cs="Calibri" w:eastAsia="Calibri" w:hAnsi="Calibri"/>
+                <w:sz w:val="20"/>
+                <w:szCs w:val="20"/>
+              </w:rPr>
+              <w:t xml:space="preserve"/>
+            </w:r>
+          </w:p>
+        </w:tc>
+        <w:tc>
+          <w:tcPr>
+            <w:tcW w:type="dxa" w:w="1500"/>
+            <w:tcBorders>
+              <w:top w:val="single" w:color="C9D3CD" w:sz="4"/>
+              <w:left w:val="single" w:color="C9D3CD" w:sz="4"/>
+              <w:bottom w:val="single" w:color="C9D3CD" w:sz="4"/>
+              <w:right w:val="single" w:color="C9D3CD" w:sz="4"/>
+            </w:tcBorders>
+            <w:shd w:fill="FFFFFF" w:color="auto" w:val="clear"/>
+            <w:tcMar>
+              <w:top w:type="dxa" w:w="80"/>
+              <w:left w:type="dxa" w:w="110"/>
+              <w:bottom w:type="dxa" w:w="80"/>
+              <w:right w:type="dxa" w:w="110"/>
+            </w:tcMar>
+          </w:tcPr>
+          <w:p>
+            <w:pPr>
+              <w:spacing w:after="0"/>
+            </w:pPr>
+            <w:r>
+              <w:rPr>
+                <w:rFonts w:ascii="Calibri" w:cs="Calibri" w:eastAsia="Calibri" w:hAnsi="Calibri"/>
+                <w:sz w:val="20"/>
+                <w:szCs w:val="20"/>
+              </w:rPr>
+              <w:t xml:space="preserve"/>
+            </w:r>
+          </w:p>
+        </w:tc>
+        <w:tc>
+          <w:tcPr>
+            <w:tcW w:type="dxa" w:w="1300"/>
+            <w:tcBorders>
+              <w:top w:val="single" w:color="C9D3CD" w:sz="4"/>
+              <w:left w:val="single" w:color="C9D3CD" w:sz="4"/>
+              <w:bottom w:val="single" w:color="C9D3CD" w:sz="4"/>
+              <w:right w:val="single" w:color="C9D3CD" w:sz="4"/>
+            </w:tcBorders>
+            <w:shd w:fill="FFFFFF" w:color="auto" w:val="clear"/>
+            <w:tcMar>
+              <w:top w:type="dxa" w:w="80"/>
+              <w:left w:type="dxa" w:w="110"/>
+              <w:bottom w:type="dxa" w:w="80"/>
+              <w:right w:type="dxa" w:w="110"/>
+            </w:tcMar>
+          </w:tcPr>
+          <w:p>
+            <w:pPr>
+              <w:spacing w:after="0"/>
+            </w:pPr>
+            <w:r>
+              <w:rPr>
+                <w:rFonts w:ascii="Calibri" w:cs="Calibri" w:eastAsia="Calibri" w:hAnsi="Calibri"/>
+                <w:sz w:val="20"/>
+                <w:szCs w:val="20"/>
+              </w:rPr>
+              <w:t xml:space="preserve"/>
+            </w:r>
+          </w:p>
+        </w:tc>
+        <w:tc>
+          <w:tcPr>
+            <w:tcW w:type="dxa" w:w="1438"/>
+            <w:tcBorders>
+              <w:top w:val="single" w:color="C9D3CD" w:sz="4"/>
+              <w:left w:val="single" w:color="C9D3CD" w:sz="4"/>
+              <w:bottom w:val="single" w:color="C9D3CD" w:sz="4"/>
+              <w:right w:val="single" w:color="C9D3CD" w:sz="4"/>
+            </w:tcBorders>
+            <w:shd w:fill="FFFFFF" w:color="auto" w:val="clear"/>
+            <w:tcMar>
+              <w:top w:type="dxa" w:w="80"/>
+              <w:left w:type="dxa" w:w="110"/>
+              <w:bottom w:type="dxa" w:w="80"/>
+              <w:right w:type="dxa" w:w="110"/>
+            </w:tcMar>
+          </w:tcPr>
+          <w:p>
+            <w:pPr>
+              <w:spacing w:after="0"/>
+            </w:pPr>
+            <w:r>
+              <w:rPr>
+                <w:rFonts w:ascii="Calibri" w:cs="Calibri" w:eastAsia="Calibri" w:hAnsi="Calibri"/>
+                <w:sz w:val="20"/>
+                <w:szCs w:val="20"/>
+              </w:rPr>
+              <w:t xml:space="preserve"/>
+            </w:r>
+          </w:p>
+        </w:tc>
+        <w:tc>
+          <w:tcPr>
+            <w:tcW w:type="dxa" w:w="1200"/>
+            <w:tcBorders>
+              <w:top w:val="single" w:color="C9D3CD" w:sz="4"/>
+              <w:left w:val="single" w:color="C9D3CD" w:sz="4"/>
+              <w:bottom w:val="single" w:color="C9D3CD" w:sz="4"/>
+              <w:right w:val="single" w:color="C9D3CD" w:sz="4"/>
+            </w:tcBorders>
+            <w:shd w:fill="FFFFFF" w:color="auto" w:val="clear"/>
+            <w:tcMar>
+              <w:top w:type="dxa" w:w="80"/>
+              <w:left w:type="dxa" w:w="110"/>
+              <w:bottom w:type="dxa" w:w="80"/>
+              <w:right w:type="dxa" w:w="110"/>
+            </w:tcMar>
+          </w:tcPr>
+          <w:p>
+            <w:pPr>
+              <w:spacing w:after="0"/>
+            </w:pPr>
+            <w:r>
+              <w:rPr>
+                <w:rFonts w:ascii="Calibri" w:cs="Calibri" w:eastAsia="Calibri" w:hAnsi="Calibri"/>
+                <w:sz w:val="20"/>
+                <w:szCs w:val="20"/>
+              </w:rPr>
+              <w:t xml:space="preserve"/>
+            </w:r>
+          </w:p>
+        </w:tc>
+      </w:tr>
+      <w:tr>
+        <w:trPr>
+          <w:cantSplit/>
+        </w:trPr>
+        <w:tc>
+          <w:tcPr>
+            <w:tcW w:type="dxa" w:w="1900"/>
+            <w:tcBorders>
+              <w:top w:val="single" w:color="C9D3CD" w:sz="4"/>
+              <w:left w:val="single" w:color="C9D3CD" w:sz="4"/>
+              <w:bottom w:val="single" w:color="C9D3CD" w:sz="4"/>
+              <w:right w:val="single" w:color="C9D3CD" w:sz="4"/>
+            </w:tcBorders>
+            <w:shd w:fill="FAFBFA" w:color="auto" w:val="clear"/>
+            <w:tcMar>
+              <w:top w:type="dxa" w:w="80"/>
+              <w:left w:type="dxa" w:w="110"/>
+              <w:bottom w:type="dxa" w:w="80"/>
+              <w:right w:type="dxa" w:w="110"/>
+            </w:tcMar>
+          </w:tcPr>
+          <w:p>
+            <w:pPr>
+              <w:spacing w:after="0"/>
+            </w:pPr>
+            <w:r>
+              <w:rPr>
+                <w:rFonts w:ascii="Calibri" w:cs="Calibri" w:eastAsia="Calibri" w:hAnsi="Calibri"/>
+                <w:sz w:val="20"/>
+                <w:szCs w:val="20"/>
+              </w:rPr>
+              <w:t xml:space="preserve"/>
+            </w:r>
+          </w:p>
+        </w:tc>
+        <w:tc>
+          <w:tcPr>
+            <w:tcW w:type="dxa" w:w="2300"/>
+            <w:tcBorders>
+              <w:top w:val="single" w:color="C9D3CD" w:sz="4"/>
+              <w:left w:val="single" w:color="C9D3CD" w:sz="4"/>
+              <w:bottom w:val="single" w:color="C9D3CD" w:sz="4"/>
+              <w:right w:val="single" w:color="C9D3CD" w:sz="4"/>
+            </w:tcBorders>
+            <w:shd w:fill="FAFBFA" w:color="auto" w:val="clear"/>
+            <w:tcMar>
+              <w:top w:type="dxa" w:w="80"/>
+              <w:left w:type="dxa" w:w="110"/>
+              <w:bottom w:type="dxa" w:w="80"/>
+              <w:right w:type="dxa" w:w="110"/>
+            </w:tcMar>
+          </w:tcPr>
+          <w:p>
+            <w:pPr>
+              <w:spacing w:after="0"/>
+            </w:pPr>
+            <w:r>
+              <w:rPr>
+                <w:rFonts w:ascii="Calibri" w:cs="Calibri" w:eastAsia="Calibri" w:hAnsi="Calibri"/>
+                <w:sz w:val="20"/>
+                <w:szCs w:val="20"/>
+              </w:rPr>
+              <w:t xml:space="preserve"/>
+            </w:r>
+          </w:p>
+        </w:tc>
+        <w:tc>
+          <w:tcPr>
+            <w:tcW w:type="dxa" w:w="1500"/>
+            <w:tcBorders>
+              <w:top w:val="single" w:color="C9D3CD" w:sz="4"/>
+              <w:left w:val="single" w:color="C9D3CD" w:sz="4"/>
+              <w:bottom w:val="single" w:color="C9D3CD" w:sz="4"/>
+              <w:right w:val="single" w:color="C9D3CD" w:sz="4"/>
+            </w:tcBorders>
+            <w:shd w:fill="FAFBFA" w:color="auto" w:val="clear"/>
+            <w:tcMar>
+              <w:top w:type="dxa" w:w="80"/>
+              <w:left w:type="dxa" w:w="110"/>
+              <w:bottom w:type="dxa" w:w="80"/>
+              <w:right w:type="dxa" w:w="110"/>
+            </w:tcMar>
+          </w:tcPr>
+          <w:p>
+            <w:pPr>
+              <w:spacing w:after="0"/>
+            </w:pPr>
+            <w:r>
+              <w:rPr>
+                <w:rFonts w:ascii="Calibri" w:cs="Calibri" w:eastAsia="Calibri" w:hAnsi="Calibri"/>
+                <w:sz w:val="20"/>
+                <w:szCs w:val="20"/>
+              </w:rPr>
+              <w:t xml:space="preserve"/>
+            </w:r>
+          </w:p>
+        </w:tc>
+        <w:tc>
+          <w:tcPr>
+            <w:tcW w:type="dxa" w:w="1300"/>
+            <w:tcBorders>
+              <w:top w:val="single" w:color="C9D3CD" w:sz="4"/>
+              <w:left w:val="single" w:color="C9D3CD" w:sz="4"/>
+              <w:bottom w:val="single" w:color="C9D3CD" w:sz="4"/>
+              <w:right w:val="single" w:color="C9D3CD" w:sz="4"/>
+            </w:tcBorders>
+            <w:shd w:fill="FAFBFA" w:color="auto" w:val="clear"/>
+            <w:tcMar>
+              <w:top w:type="dxa" w:w="80"/>
+              <w:left w:type="dxa" w:w="110"/>
+              <w:bottom w:type="dxa" w:w="80"/>
+              <w:right w:type="dxa" w:w="110"/>
+            </w:tcMar>
+          </w:tcPr>
+          <w:p>
+            <w:pPr>
+              <w:spacing w:after="0"/>
+            </w:pPr>
+            <w:r>
+              <w:rPr>
+                <w:rFonts w:ascii="Calibri" w:cs="Calibri" w:eastAsia="Calibri" w:hAnsi="Calibri"/>
+                <w:sz w:val="20"/>
+                <w:szCs w:val="20"/>
+              </w:rPr>
+              <w:t xml:space="preserve"/>
+            </w:r>
+          </w:p>
+        </w:tc>
+        <w:tc>
+          <w:tcPr>
+            <w:tcW w:type="dxa" w:w="1438"/>
+            <w:tcBorders>
+              <w:top w:val="single" w:color="C9D3CD" w:sz="4"/>
+              <w:left w:val="single" w:color="C9D3CD" w:sz="4"/>
+              <w:bottom w:val="single" w:color="C9D3CD" w:sz="4"/>
+              <w:right w:val="single" w:color="C9D3CD" w:sz="4"/>
+            </w:tcBorders>
+            <w:shd w:fill="FAFBFA" w:color="auto" w:val="clear"/>
+            <w:tcMar>
+              <w:top w:type="dxa" w:w="80"/>
+              <w:left w:type="dxa" w:w="110"/>
+              <w:bottom w:type="dxa" w:w="80"/>
+              <w:right w:type="dxa" w:w="110"/>
+            </w:tcMar>
+          </w:tcPr>
+          <w:p>
+            <w:pPr>
+              <w:spacing w:after="0"/>
+            </w:pPr>
+            <w:r>
+              <w:rPr>
+                <w:rFonts w:ascii="Calibri" w:cs="Calibri" w:eastAsia="Calibri" w:hAnsi="Calibri"/>
+                <w:sz w:val="20"/>
+                <w:szCs w:val="20"/>
+              </w:rPr>
+              <w:t xml:space="preserve"/>
+            </w:r>
+          </w:p>
+        </w:tc>
+        <w:tc>
+          <w:tcPr>
+            <w:tcW w:type="dxa" w:w="1200"/>
+            <w:tcBorders>
+              <w:top w:val="single" w:color="C9D3CD" w:sz="4"/>
+              <w:left w:val="single" w:color="C9D3CD" w:sz="4"/>
+              <w:bottom w:val="single" w:color="C9D3CD" w:sz="4"/>
+              <w:right w:val="single" w:color="C9D3CD" w:sz="4"/>
+            </w:tcBorders>
+            <w:shd w:fill="FAFBFA" w:color="auto" w:val="clear"/>
+            <w:tcMar>
+              <w:top w:type="dxa" w:w="80"/>
+              <w:left w:type="dxa" w:w="110"/>
+              <w:bottom w:type="dxa" w:w="80"/>
+              <w:right w:type="dxa" w:w="110"/>
+            </w:tcMar>
+          </w:tcPr>
+          <w:p>
+            <w:pPr>
+              <w:spacing w:after="0"/>
+            </w:pPr>
+            <w:r>
+              <w:rPr>
+                <w:rFonts w:ascii="Calibri" w:cs="Calibri" w:eastAsia="Calibri" w:hAnsi="Calibri"/>
+                <w:sz w:val="20"/>
+                <w:szCs w:val="20"/>
+              </w:rPr>
+              <w:t xml:space="preserve"/>
+            </w:r>
+          </w:p>
+        </w:tc>
+      </w:tr>
+    </w:tbl>
+    <w:p>
+      <w:pPr>
+        <w:spacing w:before="160"/>
+      </w:pPr>
+      <w:r>
+        <w:rPr>
+          <w:rFonts w:ascii="Calibri" w:cs="Calibri" w:eastAsia="Calibri" w:hAnsi="Calibri"/>
+          <w:i/>
+          <w:iCs/>
+          <w:color w:val="5F6B66"/>
+          <w:sz w:val="21"/>
+          <w:szCs w:val="21"/>
+        </w:rPr>
+        <w:t xml:space="preserve">Afronovation will review each entry and confirm whether it is already supported by the platform, can be configured, or should be considered for an enhancement or new module. A summary will be shared with the costed options.</w:t>
+      </w:r>
+    </w:p>
     <w:sectPr>
       <w:headerReference w:type="default" r:id="rId6"/>
       <w:footerReference w:type="default" r:id="rId7"/>

</xml_diff>